<commit_message>
adding react hooks notes
</commit_message>
<xml_diff>
--- a/REACT JS/Hooks/useContext.docx
+++ b/REACT JS/Hooks/useContext.docx
@@ -120,13 +120,7 @@
       </w:r>
       <w:proofErr w:type="spellEnd"/>
       <w:r>
-        <w:t xml:space="preserve"> </w:t>
-      </w:r>
-      <w:r>
-        <w:t>You have to pass props through every component.</w:t>
-      </w:r>
-      <w:r>
-        <w:t xml:space="preserve"> </w:t>
+        <w:t xml:space="preserve"> You have to pass props through every component. </w:t>
       </w:r>
       <w:r>
         <w:t xml:space="preserve">Even though Parent and Child don't use </w:t>
@@ -3586,6 +3580,4725 @@
           <w:b/>
         </w:rPr>
       </w:pPr>
+    </w:p>
+    <w:p>
+      <w:pPr>
+        <w:pStyle w:val="NoSpacing"/>
+        <w:rPr>
+          <w:b/>
+        </w:rPr>
+      </w:pPr>
+    </w:p>
+    <w:p>
+      <w:pPr>
+        <w:pStyle w:val="NoSpacing"/>
+        <w:rPr>
+          <w:b/>
+        </w:rPr>
+      </w:pPr>
+      <w:r>
+        <w:rPr>
+          <w:b/>
+        </w:rPr>
+        <w:lastRenderedPageBreak/>
+        <w:t xml:space="preserve">Below is the example for </w:t>
+      </w:r>
+      <w:proofErr w:type="spellStart"/>
+      <w:r>
+        <w:rPr>
+          <w:b/>
+        </w:rPr>
+        <w:t>useContext</w:t>
+      </w:r>
+      <w:proofErr w:type="spellEnd"/>
+      <w:r>
+        <w:rPr>
+          <w:b/>
+        </w:rPr>
+        <w:t xml:space="preserve"> for user login and display components based on </w:t>
+      </w:r>
+      <w:proofErr w:type="spellStart"/>
+      <w:r>
+        <w:rPr>
+          <w:b/>
+        </w:rPr>
+        <w:t>on</w:t>
+      </w:r>
+      <w:proofErr w:type="spellEnd"/>
+      <w:r>
+        <w:rPr>
+          <w:b/>
+        </w:rPr>
+        <w:t xml:space="preserve"> authentication</w:t>
+      </w:r>
+    </w:p>
+    <w:p>
+      <w:pPr>
+        <w:pStyle w:val="NoSpacing"/>
+        <w:rPr>
+          <w:b/>
+        </w:rPr>
+      </w:pPr>
+    </w:p>
+    <w:p>
+      <w:pPr>
+        <w:pStyle w:val="NoSpacing"/>
+        <w:rPr>
+          <w:b/>
+        </w:rPr>
+      </w:pPr>
+      <w:r>
+        <w:rPr>
+          <w:b/>
+        </w:rPr>
+        <w:t>Project Structure</w:t>
+      </w:r>
+    </w:p>
+    <w:p>
+      <w:pPr>
+        <w:pStyle w:val="NoSpacing"/>
+      </w:pPr>
+      <w:proofErr w:type="spellStart"/>
+      <w:r>
+        <w:t>src</w:t>
+      </w:r>
+      <w:proofErr w:type="spellEnd"/>
+    </w:p>
+    <w:p>
+      <w:pPr>
+        <w:pStyle w:val="NoSpacing"/>
+      </w:pPr>
+      <w:r>
+        <w:t>│</w:t>
+      </w:r>
+    </w:p>
+    <w:p>
+      <w:pPr>
+        <w:pStyle w:val="NoSpacing"/>
+      </w:pPr>
+      <w:r>
+        <w:t>├── context</w:t>
+      </w:r>
+    </w:p>
+    <w:p>
+      <w:pPr>
+        <w:pStyle w:val="NoSpacing"/>
+      </w:pPr>
+      <w:r>
+        <w:t xml:space="preserve">│   └── </w:t>
+      </w:r>
+      <w:proofErr w:type="spellStart"/>
+      <w:r>
+        <w:t>AuthContext.jsx</w:t>
+      </w:r>
+      <w:proofErr w:type="spellEnd"/>
+    </w:p>
+    <w:p>
+      <w:pPr>
+        <w:pStyle w:val="NoSpacing"/>
+      </w:pPr>
+      <w:r>
+        <w:t>│</w:t>
+      </w:r>
+    </w:p>
+    <w:p>
+      <w:pPr>
+        <w:pStyle w:val="NoSpacing"/>
+      </w:pPr>
+      <w:r>
+        <w:t>├── components</w:t>
+      </w:r>
+    </w:p>
+    <w:p>
+      <w:pPr>
+        <w:pStyle w:val="NoSpacing"/>
+      </w:pPr>
+      <w:r>
+        <w:t xml:space="preserve">│   ├── </w:t>
+      </w:r>
+      <w:proofErr w:type="spellStart"/>
+      <w:r>
+        <w:t>Login.jsx</w:t>
+      </w:r>
+      <w:proofErr w:type="spellEnd"/>
+    </w:p>
+    <w:p>
+      <w:pPr>
+        <w:pStyle w:val="NoSpacing"/>
+      </w:pPr>
+      <w:r>
+        <w:t xml:space="preserve">│   ├── </w:t>
+      </w:r>
+      <w:proofErr w:type="spellStart"/>
+      <w:r>
+        <w:t>Dashboard.jsx</w:t>
+      </w:r>
+      <w:proofErr w:type="spellEnd"/>
+    </w:p>
+    <w:p>
+      <w:pPr>
+        <w:pStyle w:val="NoSpacing"/>
+      </w:pPr>
+      <w:r>
+        <w:t xml:space="preserve">│   └── </w:t>
+      </w:r>
+      <w:proofErr w:type="spellStart"/>
+      <w:r>
+        <w:t>Navbar.jsx</w:t>
+      </w:r>
+      <w:proofErr w:type="spellEnd"/>
+    </w:p>
+    <w:p>
+      <w:pPr>
+        <w:pStyle w:val="NoSpacing"/>
+      </w:pPr>
+      <w:r>
+        <w:t>│</w:t>
+      </w:r>
+    </w:p>
+    <w:p>
+      <w:pPr>
+        <w:pStyle w:val="NoSpacing"/>
+      </w:pPr>
+      <w:r>
+        <w:t xml:space="preserve">├── </w:t>
+      </w:r>
+      <w:proofErr w:type="spellStart"/>
+      <w:r>
+        <w:t>App.jsx</w:t>
+      </w:r>
+      <w:proofErr w:type="spellEnd"/>
+    </w:p>
+    <w:p>
+      <w:pPr>
+        <w:pStyle w:val="NoSpacing"/>
+      </w:pPr>
+      <w:r>
+        <w:t xml:space="preserve">└── </w:t>
+      </w:r>
+      <w:proofErr w:type="spellStart"/>
+      <w:r>
+        <w:t>main.jsx</w:t>
+      </w:r>
+      <w:proofErr w:type="spellEnd"/>
+    </w:p>
+    <w:p>
+      <w:pPr>
+        <w:pStyle w:val="NoSpacing"/>
+      </w:pPr>
+    </w:p>
+    <w:p>
+      <w:pPr>
+        <w:pStyle w:val="NoSpacing"/>
+        <w:rPr>
+          <w:b/>
+        </w:rPr>
+      </w:pPr>
+      <w:r>
+        <w:rPr>
+          <w:b/>
+        </w:rPr>
+        <w:t xml:space="preserve">Step 1: </w:t>
+      </w:r>
+      <w:r>
+        <w:rPr>
+          <w:b/>
+        </w:rPr>
+        <w:t>context/</w:t>
+      </w:r>
+      <w:proofErr w:type="spellStart"/>
+      <w:r>
+        <w:rPr>
+          <w:b/>
+        </w:rPr>
+        <w:t>AuthContext.jsx</w:t>
+      </w:r>
+      <w:proofErr w:type="spellEnd"/>
+    </w:p>
+    <w:p>
+      <w:pPr>
+        <w:pStyle w:val="NoSpacing"/>
+      </w:pPr>
+    </w:p>
+    <w:p>
+      <w:pPr>
+        <w:pStyle w:val="NoSpacing"/>
+      </w:pPr>
+      <w:r>
+        <w:t xml:space="preserve">import </w:t>
+      </w:r>
+      <w:proofErr w:type="gramStart"/>
+      <w:r>
+        <w:t xml:space="preserve">{ </w:t>
+      </w:r>
+      <w:proofErr w:type="spellStart"/>
+      <w:r>
+        <w:t>createContext</w:t>
+      </w:r>
+      <w:proofErr w:type="spellEnd"/>
+      <w:proofErr w:type="gramEnd"/>
+      <w:r>
+        <w:t xml:space="preserve">, </w:t>
+      </w:r>
+      <w:proofErr w:type="spellStart"/>
+      <w:r>
+        <w:t>useContext</w:t>
+      </w:r>
+      <w:proofErr w:type="spellEnd"/>
+      <w:r>
+        <w:t xml:space="preserve">, </w:t>
+      </w:r>
+      <w:proofErr w:type="spellStart"/>
+      <w:r>
+        <w:t>useState</w:t>
+      </w:r>
+      <w:proofErr w:type="spellEnd"/>
+      <w:r>
+        <w:t xml:space="preserve">, </w:t>
+      </w:r>
+      <w:proofErr w:type="spellStart"/>
+      <w:r>
+        <w:t>useEffect</w:t>
+      </w:r>
+      <w:proofErr w:type="spellEnd"/>
+      <w:r>
+        <w:t xml:space="preserve"> } from "react";</w:t>
+      </w:r>
+    </w:p>
+    <w:p>
+      <w:pPr>
+        <w:pStyle w:val="NoSpacing"/>
+      </w:pPr>
+      <w:r>
+        <w:t xml:space="preserve">const </w:t>
+      </w:r>
+      <w:proofErr w:type="spellStart"/>
+      <w:r>
+        <w:t>AuthContext</w:t>
+      </w:r>
+      <w:proofErr w:type="spellEnd"/>
+      <w:r>
+        <w:t xml:space="preserve"> = </w:t>
+      </w:r>
+      <w:proofErr w:type="spellStart"/>
+      <w:proofErr w:type="gramStart"/>
+      <w:r>
+        <w:t>createContext</w:t>
+      </w:r>
+      <w:proofErr w:type="spellEnd"/>
+      <w:r>
+        <w:t>(</w:t>
+      </w:r>
+      <w:proofErr w:type="gramEnd"/>
+      <w:r>
+        <w:t>);</w:t>
+      </w:r>
+    </w:p>
+    <w:p>
+      <w:pPr>
+        <w:pStyle w:val="NoSpacing"/>
+      </w:pPr>
+    </w:p>
+    <w:p>
+      <w:pPr>
+        <w:pStyle w:val="NoSpacing"/>
+      </w:pPr>
+      <w:r>
+        <w:t xml:space="preserve">export const </w:t>
+      </w:r>
+      <w:proofErr w:type="spellStart"/>
+      <w:r>
+        <w:t>AuthProvider</w:t>
+      </w:r>
+      <w:proofErr w:type="spellEnd"/>
+      <w:r>
+        <w:t xml:space="preserve"> = </w:t>
+      </w:r>
+      <w:proofErr w:type="gramStart"/>
+      <w:r>
+        <w:t>({ children</w:t>
+      </w:r>
+      <w:proofErr w:type="gramEnd"/>
+      <w:r>
+        <w:t xml:space="preserve"> }) =&gt; {</w:t>
+      </w:r>
+    </w:p>
+    <w:p>
+      <w:pPr>
+        <w:pStyle w:val="NoSpacing"/>
+      </w:pPr>
+      <w:r>
+        <w:t xml:space="preserve">  const [user, </w:t>
+      </w:r>
+      <w:proofErr w:type="spellStart"/>
+      <w:r>
+        <w:t>setUser</w:t>
+      </w:r>
+      <w:proofErr w:type="spellEnd"/>
+      <w:r>
+        <w:t xml:space="preserve">] = </w:t>
+      </w:r>
+      <w:proofErr w:type="spellStart"/>
+      <w:r>
+        <w:t>useState</w:t>
+      </w:r>
+      <w:proofErr w:type="spellEnd"/>
+      <w:r>
+        <w:t>(null);</w:t>
+      </w:r>
+    </w:p>
+    <w:p>
+      <w:pPr>
+        <w:pStyle w:val="NoSpacing"/>
+      </w:pPr>
+    </w:p>
+    <w:p>
+      <w:pPr>
+        <w:pStyle w:val="NoSpacing"/>
+      </w:pPr>
+      <w:r>
+        <w:t xml:space="preserve">  </w:t>
+      </w:r>
+      <w:proofErr w:type="spellStart"/>
+      <w:proofErr w:type="gramStart"/>
+      <w:r>
+        <w:t>useEffect</w:t>
+      </w:r>
+      <w:proofErr w:type="spellEnd"/>
+      <w:r>
+        <w:t>(</w:t>
+      </w:r>
+      <w:proofErr w:type="gramEnd"/>
+      <w:r>
+        <w:t>() =&gt; {</w:t>
+      </w:r>
+    </w:p>
+    <w:p>
+      <w:pPr>
+        <w:pStyle w:val="NoSpacing"/>
+      </w:pPr>
+      <w:r>
+        <w:t xml:space="preserve">    const </w:t>
+      </w:r>
+      <w:proofErr w:type="spellStart"/>
+      <w:r>
+        <w:t>storedUser</w:t>
+      </w:r>
+      <w:proofErr w:type="spellEnd"/>
+      <w:r>
+        <w:t xml:space="preserve"> = </w:t>
+      </w:r>
+      <w:proofErr w:type="spellStart"/>
+      <w:r>
+        <w:t>localStorage.getItem</w:t>
+      </w:r>
+      <w:proofErr w:type="spellEnd"/>
+      <w:r>
+        <w:t>("user");</w:t>
+      </w:r>
+    </w:p>
+    <w:p>
+      <w:pPr>
+        <w:pStyle w:val="NoSpacing"/>
+      </w:pPr>
+    </w:p>
+    <w:p>
+      <w:pPr>
+        <w:pStyle w:val="NoSpacing"/>
+      </w:pPr>
+      <w:r>
+        <w:t xml:space="preserve">    if (</w:t>
+      </w:r>
+      <w:proofErr w:type="spellStart"/>
+      <w:r>
+        <w:t>storedUser</w:t>
+      </w:r>
+      <w:proofErr w:type="spellEnd"/>
+      <w:r>
+        <w:t>) {</w:t>
+      </w:r>
+    </w:p>
+    <w:p>
+      <w:pPr>
+        <w:pStyle w:val="NoSpacing"/>
+      </w:pPr>
+      <w:r>
+        <w:t xml:space="preserve">      </w:t>
+      </w:r>
+      <w:proofErr w:type="spellStart"/>
+      <w:proofErr w:type="gramStart"/>
+      <w:r>
+        <w:t>setUser</w:t>
+      </w:r>
+      <w:proofErr w:type="spellEnd"/>
+      <w:r>
+        <w:t>(</w:t>
+      </w:r>
+      <w:proofErr w:type="spellStart"/>
+      <w:proofErr w:type="gramEnd"/>
+      <w:r>
+        <w:t>JSON.parse</w:t>
+      </w:r>
+      <w:proofErr w:type="spellEnd"/>
+      <w:r>
+        <w:t>(</w:t>
+      </w:r>
+      <w:proofErr w:type="spellStart"/>
+      <w:r>
+        <w:t>storedUser</w:t>
+      </w:r>
+      <w:proofErr w:type="spellEnd"/>
+      <w:r>
+        <w:t>));</w:t>
+      </w:r>
+    </w:p>
+    <w:p>
+      <w:pPr>
+        <w:pStyle w:val="NoSpacing"/>
+      </w:pPr>
+      <w:r>
+        <w:t xml:space="preserve">    }</w:t>
+      </w:r>
+    </w:p>
+    <w:p>
+      <w:pPr>
+        <w:pStyle w:val="NoSpacing"/>
+      </w:pPr>
+      <w:r>
+        <w:t xml:space="preserve">  }, []);</w:t>
+      </w:r>
+    </w:p>
+    <w:p>
+      <w:pPr>
+        <w:pStyle w:val="NoSpacing"/>
+      </w:pPr>
+    </w:p>
+    <w:p>
+      <w:pPr>
+        <w:pStyle w:val="NoSpacing"/>
+      </w:pPr>
+      <w:r>
+        <w:t xml:space="preserve">  const login = (username, password) =&gt; {</w:t>
+      </w:r>
+    </w:p>
+    <w:p>
+      <w:pPr>
+        <w:pStyle w:val="NoSpacing"/>
+      </w:pPr>
+    </w:p>
+    <w:p>
+      <w:pPr>
+        <w:pStyle w:val="NoSpacing"/>
+      </w:pPr>
+      <w:r>
+        <w:t xml:space="preserve">    if (username === "</w:t>
+      </w:r>
+      <w:proofErr w:type="spellStart"/>
+      <w:r>
+        <w:t>anand</w:t>
+      </w:r>
+      <w:proofErr w:type="spellEnd"/>
+      <w:r>
+        <w:t>" &amp;&amp; password === "12345") {</w:t>
+      </w:r>
+    </w:p>
+    <w:p>
+      <w:pPr>
+        <w:pStyle w:val="NoSpacing"/>
+      </w:pPr>
+      <w:r>
+        <w:t xml:space="preserve">      const </w:t>
+      </w:r>
+      <w:proofErr w:type="spellStart"/>
+      <w:r>
+        <w:t>loggedInUser</w:t>
+      </w:r>
+      <w:proofErr w:type="spellEnd"/>
+      <w:r>
+        <w:t xml:space="preserve"> = </w:t>
+      </w:r>
+      <w:proofErr w:type="gramStart"/>
+      <w:r>
+        <w:t>{ username</w:t>
+      </w:r>
+      <w:proofErr w:type="gramEnd"/>
+      <w:r>
+        <w:t xml:space="preserve"> };</w:t>
+      </w:r>
+    </w:p>
+    <w:p>
+      <w:pPr>
+        <w:pStyle w:val="NoSpacing"/>
+      </w:pPr>
+      <w:r>
+        <w:t xml:space="preserve">      </w:t>
+      </w:r>
+      <w:proofErr w:type="spellStart"/>
+      <w:r>
+        <w:t>setUser</w:t>
+      </w:r>
+      <w:proofErr w:type="spellEnd"/>
+      <w:r>
+        <w:t>(</w:t>
+      </w:r>
+      <w:proofErr w:type="spellStart"/>
+      <w:r>
+        <w:t>loggedInUser</w:t>
+      </w:r>
+      <w:proofErr w:type="spellEnd"/>
+      <w:r>
+        <w:t>);</w:t>
+      </w:r>
+    </w:p>
+    <w:p>
+      <w:pPr>
+        <w:pStyle w:val="NoSpacing"/>
+      </w:pPr>
+      <w:r>
+        <w:t xml:space="preserve">      </w:t>
+      </w:r>
+      <w:proofErr w:type="spellStart"/>
+      <w:r>
+        <w:t>localStorage.setItem</w:t>
+      </w:r>
+      <w:proofErr w:type="spellEnd"/>
+      <w:r>
+        <w:t xml:space="preserve">("user", </w:t>
+      </w:r>
+      <w:proofErr w:type="spellStart"/>
+      <w:r>
+        <w:t>JSON.stringify</w:t>
+      </w:r>
+      <w:proofErr w:type="spellEnd"/>
+      <w:r>
+        <w:t>(</w:t>
+      </w:r>
+      <w:proofErr w:type="spellStart"/>
+      <w:r>
+        <w:t>loggedInUser</w:t>
+      </w:r>
+      <w:proofErr w:type="spellEnd"/>
+      <w:r>
+        <w:t>));</w:t>
+      </w:r>
+    </w:p>
+    <w:p>
+      <w:pPr>
+        <w:pStyle w:val="NoSpacing"/>
+      </w:pPr>
+      <w:r>
+        <w:t xml:space="preserve">      return true;</w:t>
+      </w:r>
+    </w:p>
+    <w:p>
+      <w:pPr>
+        <w:pStyle w:val="NoSpacing"/>
+      </w:pPr>
+      <w:r>
+        <w:t xml:space="preserve">    }</w:t>
+      </w:r>
+    </w:p>
+    <w:p>
+      <w:pPr>
+        <w:pStyle w:val="NoSpacing"/>
+      </w:pPr>
+    </w:p>
+    <w:p>
+      <w:pPr>
+        <w:pStyle w:val="NoSpacing"/>
+      </w:pPr>
+      <w:r>
+        <w:t xml:space="preserve">    return false;</w:t>
+      </w:r>
+    </w:p>
+    <w:p>
+      <w:pPr>
+        <w:pStyle w:val="NoSpacing"/>
+      </w:pPr>
+      <w:r>
+        <w:t xml:space="preserve">  };</w:t>
+      </w:r>
+    </w:p>
+    <w:p>
+      <w:pPr>
+        <w:pStyle w:val="NoSpacing"/>
+      </w:pPr>
+    </w:p>
+    <w:p>
+      <w:pPr>
+        <w:pStyle w:val="NoSpacing"/>
+      </w:pPr>
+      <w:r>
+        <w:t xml:space="preserve">  const logout = () =&gt; {</w:t>
+      </w:r>
+    </w:p>
+    <w:p>
+      <w:pPr>
+        <w:pStyle w:val="NoSpacing"/>
+      </w:pPr>
+      <w:r>
+        <w:t xml:space="preserve">    </w:t>
+      </w:r>
+      <w:proofErr w:type="spellStart"/>
+      <w:r>
+        <w:t>setUser</w:t>
+      </w:r>
+      <w:proofErr w:type="spellEnd"/>
+      <w:r>
+        <w:t>(null);</w:t>
+      </w:r>
+    </w:p>
+    <w:p>
+      <w:pPr>
+        <w:pStyle w:val="NoSpacing"/>
+      </w:pPr>
+      <w:r>
+        <w:t xml:space="preserve">    </w:t>
+      </w:r>
+      <w:proofErr w:type="spellStart"/>
+      <w:r>
+        <w:t>localStorage.removeItem</w:t>
+      </w:r>
+      <w:proofErr w:type="spellEnd"/>
+      <w:r>
+        <w:t>("user");</w:t>
+      </w:r>
+    </w:p>
+    <w:p>
+      <w:pPr>
+        <w:pStyle w:val="NoSpacing"/>
+      </w:pPr>
+      <w:r>
+        <w:t xml:space="preserve">  };</w:t>
+      </w:r>
+    </w:p>
+    <w:p>
+      <w:pPr>
+        <w:pStyle w:val="NoSpacing"/>
+      </w:pPr>
+    </w:p>
+    <w:p>
+      <w:pPr>
+        <w:pStyle w:val="NoSpacing"/>
+      </w:pPr>
+      <w:r>
+        <w:lastRenderedPageBreak/>
+        <w:t xml:space="preserve">  return (</w:t>
+      </w:r>
+    </w:p>
+    <w:p>
+      <w:pPr>
+        <w:pStyle w:val="NoSpacing"/>
+      </w:pPr>
+      <w:r>
+        <w:t xml:space="preserve">    &lt;</w:t>
+      </w:r>
+      <w:proofErr w:type="spellStart"/>
+      <w:r>
+        <w:t>AuthContext.Provider</w:t>
+      </w:r>
+      <w:proofErr w:type="spellEnd"/>
+      <w:r>
+        <w:t xml:space="preserve"> value</w:t>
+      </w:r>
+      <w:proofErr w:type="gramStart"/>
+      <w:r>
+        <w:t>={</w:t>
+      </w:r>
+      <w:proofErr w:type="gramEnd"/>
+      <w:r>
+        <w:t>{ user, login, logout }}&gt;</w:t>
+      </w:r>
+    </w:p>
+    <w:p>
+      <w:pPr>
+        <w:pStyle w:val="NoSpacing"/>
+      </w:pPr>
+      <w:r>
+        <w:t xml:space="preserve">      {children}</w:t>
+      </w:r>
+    </w:p>
+    <w:p>
+      <w:pPr>
+        <w:pStyle w:val="NoSpacing"/>
+      </w:pPr>
+      <w:r>
+        <w:t xml:space="preserve">    &lt;/</w:t>
+      </w:r>
+      <w:proofErr w:type="spellStart"/>
+      <w:r>
+        <w:t>AuthContext.Provider</w:t>
+      </w:r>
+      <w:proofErr w:type="spellEnd"/>
+      <w:r>
+        <w:t>&gt;</w:t>
+      </w:r>
+    </w:p>
+    <w:p>
+      <w:pPr>
+        <w:pStyle w:val="NoSpacing"/>
+      </w:pPr>
+      <w:r>
+        <w:t xml:space="preserve">  );</w:t>
+      </w:r>
+    </w:p>
+    <w:p>
+      <w:pPr>
+        <w:pStyle w:val="NoSpacing"/>
+      </w:pPr>
+      <w:r>
+        <w:t>};</w:t>
+      </w:r>
+    </w:p>
+    <w:p>
+      <w:pPr>
+        <w:pStyle w:val="NoSpacing"/>
+      </w:pPr>
+    </w:p>
+    <w:p>
+      <w:pPr>
+        <w:pStyle w:val="NoSpacing"/>
+      </w:pPr>
+      <w:r>
+        <w:t xml:space="preserve">export const </w:t>
+      </w:r>
+      <w:proofErr w:type="spellStart"/>
+      <w:r>
+        <w:t>useAuth</w:t>
+      </w:r>
+      <w:proofErr w:type="spellEnd"/>
+      <w:r>
+        <w:t xml:space="preserve"> = () =&gt; </w:t>
+      </w:r>
+      <w:proofErr w:type="spellStart"/>
+      <w:proofErr w:type="gramStart"/>
+      <w:r>
+        <w:t>useContext</w:t>
+      </w:r>
+      <w:proofErr w:type="spellEnd"/>
+      <w:r>
+        <w:t>(</w:t>
+      </w:r>
+      <w:proofErr w:type="spellStart"/>
+      <w:proofErr w:type="gramEnd"/>
+      <w:r>
+        <w:t>AuthContext</w:t>
+      </w:r>
+      <w:proofErr w:type="spellEnd"/>
+      <w:r>
+        <w:t>);</w:t>
+      </w:r>
+    </w:p>
+    <w:p>
+      <w:pPr>
+        <w:pStyle w:val="NoSpacing"/>
+      </w:pPr>
+    </w:p>
+    <w:p>
+      <w:pPr>
+        <w:pStyle w:val="NoSpacing"/>
+        <w:rPr>
+          <w:b/>
+        </w:rPr>
+      </w:pPr>
+      <w:r>
+        <w:rPr>
+          <w:b/>
+        </w:rPr>
+        <w:t xml:space="preserve">Step </w:t>
+      </w:r>
+      <w:proofErr w:type="gramStart"/>
+      <w:r>
+        <w:rPr>
+          <w:b/>
+        </w:rPr>
+        <w:t>2 :</w:t>
+      </w:r>
+      <w:proofErr w:type="gramEnd"/>
+      <w:r>
+        <w:rPr>
+          <w:b/>
+        </w:rPr>
+        <w:t xml:space="preserve"> Wrap App</w:t>
+      </w:r>
+    </w:p>
+    <w:p>
+      <w:pPr>
+        <w:pStyle w:val="NoSpacing"/>
+        <w:rPr>
+          <w:b/>
+        </w:rPr>
+      </w:pPr>
+      <w:proofErr w:type="spellStart"/>
+      <w:r>
+        <w:rPr>
+          <w:b/>
+        </w:rPr>
+        <w:t>main.jsx</w:t>
+      </w:r>
+      <w:proofErr w:type="spellEnd"/>
+    </w:p>
+    <w:p>
+      <w:pPr>
+        <w:pStyle w:val="NoSpacing"/>
+        <w:rPr>
+          <w:rStyle w:val="g"/>
+        </w:rPr>
+      </w:pPr>
+    </w:p>
+    <w:p>
+      <w:pPr>
+        <w:pStyle w:val="NoSpacing"/>
+        <w:rPr>
+          <w:rStyle w:val="HTMLCode"/>
+          <w:rFonts w:ascii="Times New Roman" w:eastAsiaTheme="minorHAnsi" w:hAnsi="Times New Roman" w:cstheme="minorBidi"/>
+          <w:sz w:val="24"/>
+          <w:szCs w:val="22"/>
+        </w:rPr>
+      </w:pPr>
+      <w:r>
+        <w:rPr>
+          <w:rStyle w:val="g"/>
+        </w:rPr>
+        <w:t>import</w:t>
+      </w:r>
+      <w:r>
+        <w:rPr>
+          <w:rStyle w:val="HTMLCode"/>
+          <w:rFonts w:ascii="Times New Roman" w:eastAsiaTheme="minorHAnsi" w:hAnsi="Times New Roman" w:cstheme="minorBidi"/>
+          <w:sz w:val="24"/>
+          <w:szCs w:val="22"/>
+        </w:rPr>
+        <w:t xml:space="preserve"> </w:t>
+      </w:r>
+      <w:r>
+        <w:rPr>
+          <w:rStyle w:val="m"/>
+        </w:rPr>
+        <w:t>React</w:t>
+      </w:r>
+      <w:r>
+        <w:rPr>
+          <w:rStyle w:val="HTMLCode"/>
+          <w:rFonts w:ascii="Times New Roman" w:eastAsiaTheme="minorHAnsi" w:hAnsi="Times New Roman" w:cstheme="minorBidi"/>
+          <w:sz w:val="24"/>
+          <w:szCs w:val="22"/>
+        </w:rPr>
+        <w:t xml:space="preserve"> </w:t>
+      </w:r>
+      <w:r>
+        <w:rPr>
+          <w:rStyle w:val="g"/>
+        </w:rPr>
+        <w:t>from</w:t>
+      </w:r>
+      <w:r>
+        <w:rPr>
+          <w:rStyle w:val="HTMLCode"/>
+          <w:rFonts w:ascii="Times New Roman" w:eastAsiaTheme="minorHAnsi" w:hAnsi="Times New Roman" w:cstheme="minorBidi"/>
+          <w:sz w:val="24"/>
+          <w:szCs w:val="22"/>
+        </w:rPr>
+        <w:t xml:space="preserve"> </w:t>
+      </w:r>
+      <w:r>
+        <w:rPr>
+          <w:rStyle w:val="k"/>
+        </w:rPr>
+        <w:t>"react"</w:t>
+      </w:r>
+      <w:r>
+        <w:rPr>
+          <w:rStyle w:val="HTMLCode"/>
+          <w:rFonts w:ascii="Times New Roman" w:eastAsiaTheme="minorHAnsi" w:hAnsi="Times New Roman" w:cstheme="minorBidi"/>
+          <w:sz w:val="24"/>
+          <w:szCs w:val="22"/>
+        </w:rPr>
+        <w:t>;</w:t>
+      </w:r>
+    </w:p>
+    <w:p>
+      <w:pPr>
+        <w:pStyle w:val="NoSpacing"/>
+        <w:rPr>
+          <w:rStyle w:val="HTMLCode"/>
+          <w:rFonts w:ascii="Times New Roman" w:eastAsiaTheme="minorHAnsi" w:hAnsi="Times New Roman" w:cstheme="minorBidi"/>
+          <w:sz w:val="24"/>
+          <w:szCs w:val="22"/>
+        </w:rPr>
+      </w:pPr>
+      <w:r>
+        <w:rPr>
+          <w:rStyle w:val="g"/>
+        </w:rPr>
+        <w:t>import</w:t>
+      </w:r>
+      <w:r>
+        <w:rPr>
+          <w:rStyle w:val="HTMLCode"/>
+          <w:rFonts w:ascii="Times New Roman" w:eastAsiaTheme="minorHAnsi" w:hAnsi="Times New Roman" w:cstheme="minorBidi"/>
+          <w:sz w:val="24"/>
+          <w:szCs w:val="22"/>
+        </w:rPr>
+        <w:t xml:space="preserve"> </w:t>
+      </w:r>
+      <w:proofErr w:type="spellStart"/>
+      <w:r>
+        <w:rPr>
+          <w:rStyle w:val="m"/>
+        </w:rPr>
+        <w:t>ReactDOM</w:t>
+      </w:r>
+      <w:proofErr w:type="spellEnd"/>
+      <w:r>
+        <w:rPr>
+          <w:rStyle w:val="HTMLCode"/>
+          <w:rFonts w:ascii="Times New Roman" w:eastAsiaTheme="minorHAnsi" w:hAnsi="Times New Roman" w:cstheme="minorBidi"/>
+          <w:sz w:val="24"/>
+          <w:szCs w:val="22"/>
+        </w:rPr>
+        <w:t xml:space="preserve"> </w:t>
+      </w:r>
+      <w:r>
+        <w:rPr>
+          <w:rStyle w:val="g"/>
+        </w:rPr>
+        <w:t>from</w:t>
+      </w:r>
+      <w:r>
+        <w:rPr>
+          <w:rStyle w:val="HTMLCode"/>
+          <w:rFonts w:ascii="Times New Roman" w:eastAsiaTheme="minorHAnsi" w:hAnsi="Times New Roman" w:cstheme="minorBidi"/>
+          <w:sz w:val="24"/>
+          <w:szCs w:val="22"/>
+        </w:rPr>
+        <w:t xml:space="preserve"> </w:t>
+      </w:r>
+      <w:r>
+        <w:rPr>
+          <w:rStyle w:val="k"/>
+        </w:rPr>
+        <w:t>"react-</w:t>
+      </w:r>
+      <w:proofErr w:type="spellStart"/>
+      <w:r>
+        <w:rPr>
+          <w:rStyle w:val="k"/>
+        </w:rPr>
+        <w:t>dom</w:t>
+      </w:r>
+      <w:proofErr w:type="spellEnd"/>
+      <w:r>
+        <w:rPr>
+          <w:rStyle w:val="k"/>
+        </w:rPr>
+        <w:t>/client"</w:t>
+      </w:r>
+      <w:r>
+        <w:rPr>
+          <w:rStyle w:val="HTMLCode"/>
+          <w:rFonts w:ascii="Times New Roman" w:eastAsiaTheme="minorHAnsi" w:hAnsi="Times New Roman" w:cstheme="minorBidi"/>
+          <w:sz w:val="24"/>
+          <w:szCs w:val="22"/>
+        </w:rPr>
+        <w:t>;</w:t>
+      </w:r>
+    </w:p>
+    <w:p>
+      <w:pPr>
+        <w:pStyle w:val="NoSpacing"/>
+        <w:rPr>
+          <w:rStyle w:val="HTMLCode"/>
+          <w:rFonts w:ascii="Times New Roman" w:eastAsiaTheme="minorHAnsi" w:hAnsi="Times New Roman" w:cstheme="minorBidi"/>
+          <w:sz w:val="24"/>
+          <w:szCs w:val="22"/>
+        </w:rPr>
+      </w:pPr>
+      <w:r>
+        <w:rPr>
+          <w:rStyle w:val="g"/>
+        </w:rPr>
+        <w:t>import</w:t>
+      </w:r>
+      <w:r>
+        <w:rPr>
+          <w:rStyle w:val="HTMLCode"/>
+          <w:rFonts w:ascii="Times New Roman" w:eastAsiaTheme="minorHAnsi" w:hAnsi="Times New Roman" w:cstheme="minorBidi"/>
+          <w:sz w:val="24"/>
+          <w:szCs w:val="22"/>
+        </w:rPr>
+        <w:t xml:space="preserve"> </w:t>
+      </w:r>
+      <w:r>
+        <w:rPr>
+          <w:rStyle w:val="m"/>
+        </w:rPr>
+        <w:t>App</w:t>
+      </w:r>
+      <w:r>
+        <w:rPr>
+          <w:rStyle w:val="HTMLCode"/>
+          <w:rFonts w:ascii="Times New Roman" w:eastAsiaTheme="minorHAnsi" w:hAnsi="Times New Roman" w:cstheme="minorBidi"/>
+          <w:sz w:val="24"/>
+          <w:szCs w:val="22"/>
+        </w:rPr>
+        <w:t xml:space="preserve"> </w:t>
+      </w:r>
+      <w:r>
+        <w:rPr>
+          <w:rStyle w:val="g"/>
+        </w:rPr>
+        <w:t>from</w:t>
+      </w:r>
+      <w:r>
+        <w:rPr>
+          <w:rStyle w:val="HTMLCode"/>
+          <w:rFonts w:ascii="Times New Roman" w:eastAsiaTheme="minorHAnsi" w:hAnsi="Times New Roman" w:cstheme="minorBidi"/>
+          <w:sz w:val="24"/>
+          <w:szCs w:val="22"/>
+        </w:rPr>
+        <w:t xml:space="preserve"> </w:t>
+      </w:r>
+      <w:proofErr w:type="gramStart"/>
+      <w:r>
+        <w:rPr>
+          <w:rStyle w:val="k"/>
+        </w:rPr>
+        <w:t>"./</w:t>
+      </w:r>
+      <w:proofErr w:type="gramEnd"/>
+      <w:r>
+        <w:rPr>
+          <w:rStyle w:val="k"/>
+        </w:rPr>
+        <w:t>App"</w:t>
+      </w:r>
+      <w:r>
+        <w:rPr>
+          <w:rStyle w:val="HTMLCode"/>
+          <w:rFonts w:ascii="Times New Roman" w:eastAsiaTheme="minorHAnsi" w:hAnsi="Times New Roman" w:cstheme="minorBidi"/>
+          <w:sz w:val="24"/>
+          <w:szCs w:val="22"/>
+        </w:rPr>
+        <w:t>;</w:t>
+      </w:r>
+    </w:p>
+    <w:p>
+      <w:pPr>
+        <w:pStyle w:val="NoSpacing"/>
+        <w:rPr>
+          <w:rStyle w:val="HTMLCode"/>
+          <w:rFonts w:ascii="Times New Roman" w:eastAsiaTheme="minorHAnsi" w:hAnsi="Times New Roman" w:cstheme="minorBidi"/>
+          <w:sz w:val="24"/>
+          <w:szCs w:val="22"/>
+        </w:rPr>
+      </w:pPr>
+      <w:r>
+        <w:rPr>
+          <w:rStyle w:val="g"/>
+        </w:rPr>
+        <w:t>import</w:t>
+      </w:r>
+      <w:r>
+        <w:rPr>
+          <w:rStyle w:val="HTMLCode"/>
+          <w:rFonts w:ascii="Times New Roman" w:eastAsiaTheme="minorHAnsi" w:hAnsi="Times New Roman" w:cstheme="minorBidi"/>
+          <w:sz w:val="24"/>
+          <w:szCs w:val="22"/>
+        </w:rPr>
+        <w:t xml:space="preserve"> </w:t>
+      </w:r>
+      <w:proofErr w:type="gramStart"/>
+      <w:r>
+        <w:rPr>
+          <w:rStyle w:val="HTMLCode"/>
+          <w:rFonts w:ascii="Times New Roman" w:eastAsiaTheme="minorHAnsi" w:hAnsi="Times New Roman" w:cstheme="minorBidi"/>
+          <w:sz w:val="24"/>
+          <w:szCs w:val="22"/>
+        </w:rPr>
+        <w:t xml:space="preserve">{ </w:t>
+      </w:r>
+      <w:proofErr w:type="spellStart"/>
+      <w:r>
+        <w:rPr>
+          <w:rStyle w:val="m"/>
+        </w:rPr>
+        <w:t>AuthProvider</w:t>
+      </w:r>
+      <w:proofErr w:type="spellEnd"/>
+      <w:proofErr w:type="gramEnd"/>
+      <w:r>
+        <w:rPr>
+          <w:rStyle w:val="HTMLCode"/>
+          <w:rFonts w:ascii="Times New Roman" w:eastAsiaTheme="minorHAnsi" w:hAnsi="Times New Roman" w:cstheme="minorBidi"/>
+          <w:sz w:val="24"/>
+          <w:szCs w:val="22"/>
+        </w:rPr>
+        <w:t xml:space="preserve"> } </w:t>
+      </w:r>
+      <w:r>
+        <w:rPr>
+          <w:rStyle w:val="g"/>
+        </w:rPr>
+        <w:t>from</w:t>
+      </w:r>
+      <w:r>
+        <w:rPr>
+          <w:rStyle w:val="HTMLCode"/>
+          <w:rFonts w:ascii="Times New Roman" w:eastAsiaTheme="minorHAnsi" w:hAnsi="Times New Roman" w:cstheme="minorBidi"/>
+          <w:sz w:val="24"/>
+          <w:szCs w:val="22"/>
+        </w:rPr>
+        <w:t xml:space="preserve"> </w:t>
+      </w:r>
+      <w:r>
+        <w:rPr>
+          <w:rStyle w:val="k"/>
+        </w:rPr>
+        <w:t>"./context/</w:t>
+      </w:r>
+      <w:proofErr w:type="spellStart"/>
+      <w:r>
+        <w:rPr>
+          <w:rStyle w:val="k"/>
+        </w:rPr>
+        <w:t>AuthContext</w:t>
+      </w:r>
+      <w:proofErr w:type="spellEnd"/>
+      <w:r>
+        <w:rPr>
+          <w:rStyle w:val="k"/>
+        </w:rPr>
+        <w:t>"</w:t>
+      </w:r>
+      <w:r>
+        <w:rPr>
+          <w:rStyle w:val="HTMLCode"/>
+          <w:rFonts w:ascii="Times New Roman" w:eastAsiaTheme="minorHAnsi" w:hAnsi="Times New Roman" w:cstheme="minorBidi"/>
+          <w:sz w:val="24"/>
+          <w:szCs w:val="22"/>
+        </w:rPr>
+        <w:t>;</w:t>
+      </w:r>
+    </w:p>
+    <w:p>
+      <w:pPr>
+        <w:pStyle w:val="NoSpacing"/>
+        <w:rPr>
+          <w:rStyle w:val="HTMLCode"/>
+          <w:rFonts w:ascii="Times New Roman" w:eastAsiaTheme="minorHAnsi" w:hAnsi="Times New Roman" w:cstheme="minorBidi"/>
+          <w:sz w:val="24"/>
+          <w:szCs w:val="22"/>
+        </w:rPr>
+      </w:pPr>
+    </w:p>
+    <w:p>
+      <w:pPr>
+        <w:pStyle w:val="NoSpacing"/>
+        <w:rPr>
+          <w:rStyle w:val="HTMLCode"/>
+          <w:rFonts w:ascii="Times New Roman" w:eastAsiaTheme="minorHAnsi" w:hAnsi="Times New Roman" w:cstheme="minorBidi"/>
+          <w:sz w:val="24"/>
+          <w:szCs w:val="22"/>
+        </w:rPr>
+      </w:pPr>
+      <w:proofErr w:type="spellStart"/>
+      <w:r>
+        <w:rPr>
+          <w:rStyle w:val="m"/>
+        </w:rPr>
+        <w:t>ReactDOM</w:t>
+      </w:r>
+      <w:r>
+        <w:rPr>
+          <w:rStyle w:val="g"/>
+        </w:rPr>
+        <w:t>.</w:t>
+      </w:r>
+      <w:r>
+        <w:rPr>
+          <w:rStyle w:val="HTMLCode"/>
+          <w:rFonts w:ascii="Times New Roman" w:eastAsiaTheme="minorHAnsi" w:hAnsi="Times New Roman" w:cstheme="minorBidi"/>
+          <w:sz w:val="24"/>
+          <w:szCs w:val="22"/>
+        </w:rPr>
+        <w:t>createRoot</w:t>
+      </w:r>
+      <w:proofErr w:type="spellEnd"/>
+      <w:r>
+        <w:rPr>
+          <w:rStyle w:val="HTMLCode"/>
+          <w:rFonts w:ascii="Times New Roman" w:eastAsiaTheme="minorHAnsi" w:hAnsi="Times New Roman" w:cstheme="minorBidi"/>
+          <w:sz w:val="24"/>
+          <w:szCs w:val="22"/>
+        </w:rPr>
+        <w:t>(</w:t>
+      </w:r>
+      <w:proofErr w:type="spellStart"/>
+      <w:proofErr w:type="gramStart"/>
+      <w:r>
+        <w:rPr>
+          <w:rStyle w:val="m"/>
+        </w:rPr>
+        <w:t>document</w:t>
+      </w:r>
+      <w:r>
+        <w:rPr>
+          <w:rStyle w:val="g"/>
+        </w:rPr>
+        <w:t>.</w:t>
+      </w:r>
+      <w:r>
+        <w:rPr>
+          <w:rStyle w:val="HTMLCode"/>
+          <w:rFonts w:ascii="Times New Roman" w:eastAsiaTheme="minorHAnsi" w:hAnsi="Times New Roman" w:cstheme="minorBidi"/>
+          <w:sz w:val="24"/>
+          <w:szCs w:val="22"/>
+        </w:rPr>
+        <w:t>getElementById</w:t>
+      </w:r>
+      <w:proofErr w:type="spellEnd"/>
+      <w:proofErr w:type="gramEnd"/>
+      <w:r>
+        <w:rPr>
+          <w:rStyle w:val="HTMLCode"/>
+          <w:rFonts w:ascii="Times New Roman" w:eastAsiaTheme="minorHAnsi" w:hAnsi="Times New Roman" w:cstheme="minorBidi"/>
+          <w:sz w:val="24"/>
+          <w:szCs w:val="22"/>
+        </w:rPr>
+        <w:t>(</w:t>
+      </w:r>
+      <w:r>
+        <w:rPr>
+          <w:rStyle w:val="k"/>
+        </w:rPr>
+        <w:t>"root"</w:t>
+      </w:r>
+      <w:r>
+        <w:rPr>
+          <w:rStyle w:val="HTMLCode"/>
+          <w:rFonts w:ascii="Times New Roman" w:eastAsiaTheme="minorHAnsi" w:hAnsi="Times New Roman" w:cstheme="minorBidi"/>
+          <w:sz w:val="24"/>
+          <w:szCs w:val="22"/>
+        </w:rPr>
+        <w:t>))</w:t>
+      </w:r>
+      <w:r>
+        <w:rPr>
+          <w:rStyle w:val="g"/>
+        </w:rPr>
+        <w:t>.</w:t>
+      </w:r>
+      <w:r>
+        <w:rPr>
+          <w:rStyle w:val="HTMLCode"/>
+          <w:rFonts w:ascii="Times New Roman" w:eastAsiaTheme="minorHAnsi" w:hAnsi="Times New Roman" w:cstheme="minorBidi"/>
+          <w:sz w:val="24"/>
+          <w:szCs w:val="22"/>
+        </w:rPr>
+        <w:t>render(</w:t>
+      </w:r>
+    </w:p>
+    <w:p>
+      <w:pPr>
+        <w:pStyle w:val="NoSpacing"/>
+        <w:rPr>
+          <w:rStyle w:val="HTMLCode"/>
+          <w:rFonts w:ascii="Times New Roman" w:eastAsiaTheme="minorHAnsi" w:hAnsi="Times New Roman" w:cstheme="minorBidi"/>
+          <w:sz w:val="24"/>
+          <w:szCs w:val="22"/>
+        </w:rPr>
+      </w:pPr>
+    </w:p>
+    <w:p>
+      <w:pPr>
+        <w:pStyle w:val="NoSpacing"/>
+        <w:rPr>
+          <w:rStyle w:val="HTMLCode"/>
+          <w:rFonts w:ascii="Times New Roman" w:eastAsiaTheme="minorHAnsi" w:hAnsi="Times New Roman" w:cstheme="minorBidi"/>
+          <w:sz w:val="24"/>
+          <w:szCs w:val="22"/>
+        </w:rPr>
+      </w:pPr>
+      <w:r>
+        <w:rPr>
+          <w:rStyle w:val="HTMLCode"/>
+          <w:rFonts w:ascii="Times New Roman" w:eastAsiaTheme="minorHAnsi" w:hAnsi="Times New Roman" w:cstheme="minorBidi"/>
+          <w:sz w:val="24"/>
+          <w:szCs w:val="22"/>
+        </w:rPr>
+        <w:t xml:space="preserve">  </w:t>
+      </w:r>
+      <w:r>
+        <w:rPr>
+          <w:rStyle w:val="o"/>
+        </w:rPr>
+        <w:t>&lt;</w:t>
+      </w:r>
+      <w:proofErr w:type="spellStart"/>
+      <w:r>
+        <w:rPr>
+          <w:rStyle w:val="o"/>
+        </w:rPr>
+        <w:t>AuthProvider</w:t>
+      </w:r>
+      <w:proofErr w:type="spellEnd"/>
+      <w:r>
+        <w:rPr>
+          <w:rStyle w:val="o"/>
+        </w:rPr>
+        <w:t>&gt;</w:t>
+      </w:r>
+    </w:p>
+    <w:p>
+      <w:pPr>
+        <w:pStyle w:val="NoSpacing"/>
+        <w:rPr>
+          <w:rStyle w:val="HTMLCode"/>
+          <w:rFonts w:ascii="Times New Roman" w:eastAsiaTheme="minorHAnsi" w:hAnsi="Times New Roman" w:cstheme="minorBidi"/>
+          <w:sz w:val="24"/>
+          <w:szCs w:val="22"/>
+        </w:rPr>
+      </w:pPr>
+      <w:r>
+        <w:rPr>
+          <w:rStyle w:val="HTMLCode"/>
+          <w:rFonts w:ascii="Times New Roman" w:eastAsiaTheme="minorHAnsi" w:hAnsi="Times New Roman" w:cstheme="minorBidi"/>
+          <w:sz w:val="24"/>
+          <w:szCs w:val="22"/>
+        </w:rPr>
+        <w:t xml:space="preserve">      </w:t>
+      </w:r>
+      <w:r>
+        <w:rPr>
+          <w:rStyle w:val="o"/>
+        </w:rPr>
+        <w:t>&lt;App</w:t>
+      </w:r>
+      <w:r>
+        <w:rPr>
+          <w:rStyle w:val="HTMLCode"/>
+          <w:rFonts w:ascii="Times New Roman" w:eastAsiaTheme="minorHAnsi" w:hAnsi="Times New Roman" w:cstheme="minorBidi"/>
+          <w:sz w:val="24"/>
+          <w:szCs w:val="22"/>
+        </w:rPr>
+        <w:t xml:space="preserve"> </w:t>
+      </w:r>
+      <w:r>
+        <w:rPr>
+          <w:rStyle w:val="o"/>
+        </w:rPr>
+        <w:t>/&gt;</w:t>
+      </w:r>
+    </w:p>
+    <w:p>
+      <w:pPr>
+        <w:pStyle w:val="NoSpacing"/>
+        <w:rPr>
+          <w:rStyle w:val="HTMLCode"/>
+          <w:rFonts w:ascii="Times New Roman" w:eastAsiaTheme="minorHAnsi" w:hAnsi="Times New Roman" w:cstheme="minorBidi"/>
+          <w:sz w:val="24"/>
+          <w:szCs w:val="22"/>
+        </w:rPr>
+      </w:pPr>
+      <w:r>
+        <w:rPr>
+          <w:rStyle w:val="HTMLCode"/>
+          <w:rFonts w:ascii="Times New Roman" w:eastAsiaTheme="minorHAnsi" w:hAnsi="Times New Roman" w:cstheme="minorBidi"/>
+          <w:sz w:val="24"/>
+          <w:szCs w:val="22"/>
+        </w:rPr>
+        <w:t xml:space="preserve">  </w:t>
+      </w:r>
+      <w:r>
+        <w:rPr>
+          <w:rStyle w:val="o"/>
+        </w:rPr>
+        <w:t>&lt;/</w:t>
+      </w:r>
+      <w:proofErr w:type="spellStart"/>
+      <w:r>
+        <w:rPr>
+          <w:rStyle w:val="o"/>
+        </w:rPr>
+        <w:t>AuthProvider</w:t>
+      </w:r>
+      <w:proofErr w:type="spellEnd"/>
+      <w:r>
+        <w:rPr>
+          <w:rStyle w:val="o"/>
+        </w:rPr>
+        <w:t>&gt;</w:t>
+      </w:r>
+    </w:p>
+    <w:p>
+      <w:pPr>
+        <w:pStyle w:val="NoSpacing"/>
+        <w:rPr>
+          <w:rStyle w:val="HTMLCode"/>
+          <w:rFonts w:ascii="Times New Roman" w:eastAsiaTheme="minorHAnsi" w:hAnsi="Times New Roman" w:cstheme="minorBidi"/>
+          <w:sz w:val="24"/>
+          <w:szCs w:val="22"/>
+        </w:rPr>
+      </w:pPr>
+    </w:p>
+    <w:p>
+      <w:pPr>
+        <w:pStyle w:val="NoSpacing"/>
+        <w:rPr>
+          <w:rStyle w:val="HTMLCode"/>
+          <w:rFonts w:ascii="Times New Roman" w:eastAsiaTheme="minorHAnsi" w:hAnsi="Times New Roman" w:cstheme="minorBidi"/>
+          <w:sz w:val="24"/>
+          <w:szCs w:val="22"/>
+        </w:rPr>
+      </w:pPr>
+      <w:r>
+        <w:rPr>
+          <w:rStyle w:val="HTMLCode"/>
+          <w:rFonts w:ascii="Times New Roman" w:eastAsiaTheme="minorHAnsi" w:hAnsi="Times New Roman" w:cstheme="minorBidi"/>
+          <w:sz w:val="24"/>
+          <w:szCs w:val="22"/>
+        </w:rPr>
+        <w:t>);</w:t>
+      </w:r>
+    </w:p>
+    <w:p>
+      <w:pPr>
+        <w:pStyle w:val="NoSpacing"/>
+      </w:pPr>
+    </w:p>
+    <w:p>
+      <w:pPr>
+        <w:pStyle w:val="NoSpacing"/>
+        <w:rPr>
+          <w:b/>
+        </w:rPr>
+      </w:pPr>
+      <w:r>
+        <w:rPr>
+          <w:b/>
+        </w:rPr>
+        <w:t>Now every component can access authentication.</w:t>
+      </w:r>
+    </w:p>
+    <w:p>
+      <w:pPr>
+        <w:pStyle w:val="NoSpacing"/>
+      </w:pPr>
+    </w:p>
+    <w:p>
+      <w:pPr>
+        <w:pStyle w:val="NoSpacing"/>
+        <w:rPr>
+          <w:b/>
+        </w:rPr>
+      </w:pPr>
+      <w:r>
+        <w:rPr>
+          <w:b/>
+        </w:rPr>
+        <w:t xml:space="preserve">Step </w:t>
+      </w:r>
+      <w:proofErr w:type="gramStart"/>
+      <w:r>
+        <w:rPr>
+          <w:b/>
+        </w:rPr>
+        <w:t>3 :</w:t>
+      </w:r>
+      <w:proofErr w:type="gramEnd"/>
+      <w:r>
+        <w:rPr>
+          <w:b/>
+        </w:rPr>
+        <w:t xml:space="preserve"> Login Component</w:t>
+      </w:r>
+    </w:p>
+    <w:p>
+      <w:pPr>
+        <w:pStyle w:val="NoSpacing"/>
+        <w:rPr>
+          <w:b/>
+        </w:rPr>
+      </w:pPr>
+      <w:r>
+        <w:rPr>
+          <w:b/>
+        </w:rPr>
+        <w:t>components/</w:t>
+      </w:r>
+      <w:proofErr w:type="spellStart"/>
+      <w:r>
+        <w:rPr>
+          <w:b/>
+        </w:rPr>
+        <w:t>Login.jsx</w:t>
+      </w:r>
+      <w:proofErr w:type="spellEnd"/>
+    </w:p>
+    <w:p>
+      <w:pPr>
+        <w:pStyle w:val="NoSpacing"/>
+      </w:pPr>
+    </w:p>
+    <w:p>
+      <w:pPr>
+        <w:pStyle w:val="NoSpacing"/>
+      </w:pPr>
+      <w:r>
+        <w:t xml:space="preserve">import </w:t>
+      </w:r>
+      <w:proofErr w:type="gramStart"/>
+      <w:r>
+        <w:t xml:space="preserve">{ </w:t>
+      </w:r>
+      <w:proofErr w:type="spellStart"/>
+      <w:r>
+        <w:t>useState</w:t>
+      </w:r>
+      <w:proofErr w:type="spellEnd"/>
+      <w:proofErr w:type="gramEnd"/>
+      <w:r>
+        <w:t xml:space="preserve"> } from "react";</w:t>
+      </w:r>
+    </w:p>
+    <w:p>
+      <w:pPr>
+        <w:pStyle w:val="NoSpacing"/>
+      </w:pPr>
+      <w:r>
+        <w:t xml:space="preserve">import </w:t>
+      </w:r>
+      <w:proofErr w:type="gramStart"/>
+      <w:r>
+        <w:t xml:space="preserve">{ </w:t>
+      </w:r>
+      <w:proofErr w:type="spellStart"/>
+      <w:r>
+        <w:t>useAuth</w:t>
+      </w:r>
+      <w:proofErr w:type="spellEnd"/>
+      <w:proofErr w:type="gramEnd"/>
+      <w:r>
+        <w:t xml:space="preserve"> } from "../context/</w:t>
+      </w:r>
+      <w:proofErr w:type="spellStart"/>
+      <w:r>
+        <w:t>AuthContext</w:t>
+      </w:r>
+      <w:proofErr w:type="spellEnd"/>
+      <w:r>
+        <w:t>";</w:t>
+      </w:r>
+    </w:p>
+    <w:p>
+      <w:pPr>
+        <w:pStyle w:val="NoSpacing"/>
+      </w:pPr>
+    </w:p>
+    <w:p>
+      <w:pPr>
+        <w:pStyle w:val="NoSpacing"/>
+      </w:pPr>
+      <w:r>
+        <w:t>const Login = () =&gt; {</w:t>
+      </w:r>
+    </w:p>
+    <w:p>
+      <w:pPr>
+        <w:pStyle w:val="NoSpacing"/>
+      </w:pPr>
+    </w:p>
+    <w:p>
+      <w:pPr>
+        <w:pStyle w:val="NoSpacing"/>
+      </w:pPr>
+      <w:r>
+        <w:t xml:space="preserve">  const </w:t>
+      </w:r>
+      <w:proofErr w:type="gramStart"/>
+      <w:r>
+        <w:t>{ login</w:t>
+      </w:r>
+      <w:proofErr w:type="gramEnd"/>
+      <w:r>
+        <w:t xml:space="preserve"> } = </w:t>
+      </w:r>
+      <w:proofErr w:type="spellStart"/>
+      <w:r>
+        <w:t>useAuth</w:t>
+      </w:r>
+      <w:proofErr w:type="spellEnd"/>
+      <w:r>
+        <w:t>();</w:t>
+      </w:r>
+    </w:p>
+    <w:p>
+      <w:pPr>
+        <w:pStyle w:val="NoSpacing"/>
+      </w:pPr>
+    </w:p>
+    <w:p>
+      <w:pPr>
+        <w:pStyle w:val="NoSpacing"/>
+      </w:pPr>
+      <w:r>
+        <w:t xml:space="preserve">  const [username, </w:t>
+      </w:r>
+      <w:proofErr w:type="spellStart"/>
+      <w:r>
+        <w:t>setUsername</w:t>
+      </w:r>
+      <w:proofErr w:type="spellEnd"/>
+      <w:r>
+        <w:t xml:space="preserve">] = </w:t>
+      </w:r>
+      <w:proofErr w:type="spellStart"/>
+      <w:proofErr w:type="gramStart"/>
+      <w:r>
+        <w:t>useState</w:t>
+      </w:r>
+      <w:proofErr w:type="spellEnd"/>
+      <w:r>
+        <w:t>(</w:t>
+      </w:r>
+      <w:proofErr w:type="gramEnd"/>
+      <w:r>
+        <w:t>"");</w:t>
+      </w:r>
+    </w:p>
+    <w:p>
+      <w:pPr>
+        <w:pStyle w:val="NoSpacing"/>
+      </w:pPr>
+      <w:r>
+        <w:t xml:space="preserve">  const [password, </w:t>
+      </w:r>
+      <w:proofErr w:type="spellStart"/>
+      <w:r>
+        <w:t>setPassword</w:t>
+      </w:r>
+      <w:proofErr w:type="spellEnd"/>
+      <w:r>
+        <w:t xml:space="preserve">] = </w:t>
+      </w:r>
+      <w:proofErr w:type="spellStart"/>
+      <w:proofErr w:type="gramStart"/>
+      <w:r>
+        <w:t>useState</w:t>
+      </w:r>
+      <w:proofErr w:type="spellEnd"/>
+      <w:r>
+        <w:t>(</w:t>
+      </w:r>
+      <w:proofErr w:type="gramEnd"/>
+      <w:r>
+        <w:t>"");</w:t>
+      </w:r>
+    </w:p>
+    <w:p>
+      <w:pPr>
+        <w:pStyle w:val="NoSpacing"/>
+      </w:pPr>
+    </w:p>
+    <w:p>
+      <w:pPr>
+        <w:pStyle w:val="NoSpacing"/>
+      </w:pPr>
+      <w:r>
+        <w:t xml:space="preserve">  const [error, </w:t>
+      </w:r>
+      <w:proofErr w:type="spellStart"/>
+      <w:r>
+        <w:t>setError</w:t>
+      </w:r>
+      <w:proofErr w:type="spellEnd"/>
+      <w:r>
+        <w:t xml:space="preserve">] = </w:t>
+      </w:r>
+      <w:proofErr w:type="spellStart"/>
+      <w:proofErr w:type="gramStart"/>
+      <w:r>
+        <w:t>useState</w:t>
+      </w:r>
+      <w:proofErr w:type="spellEnd"/>
+      <w:r>
+        <w:t>(</w:t>
+      </w:r>
+      <w:proofErr w:type="gramEnd"/>
+      <w:r>
+        <w:t>"");</w:t>
+      </w:r>
+    </w:p>
+    <w:p>
+      <w:pPr>
+        <w:pStyle w:val="NoSpacing"/>
+      </w:pPr>
+    </w:p>
+    <w:p>
+      <w:pPr>
+        <w:pStyle w:val="NoSpacing"/>
+      </w:pPr>
+      <w:r>
+        <w:t xml:space="preserve">  const </w:t>
+      </w:r>
+      <w:proofErr w:type="spellStart"/>
+      <w:r>
+        <w:t>handleSubmit</w:t>
+      </w:r>
+      <w:proofErr w:type="spellEnd"/>
+      <w:r>
+        <w:t xml:space="preserve"> = (e) =&gt; {</w:t>
+      </w:r>
+    </w:p>
+    <w:p>
+      <w:pPr>
+        <w:pStyle w:val="NoSpacing"/>
+      </w:pPr>
+    </w:p>
+    <w:p>
+      <w:pPr>
+        <w:pStyle w:val="NoSpacing"/>
+      </w:pPr>
+      <w:r>
+        <w:t xml:space="preserve">    </w:t>
+      </w:r>
+      <w:proofErr w:type="spellStart"/>
+      <w:proofErr w:type="gramStart"/>
+      <w:r>
+        <w:t>e.preventDefault</w:t>
+      </w:r>
+      <w:proofErr w:type="spellEnd"/>
+      <w:proofErr w:type="gramEnd"/>
+      <w:r>
+        <w:t>();</w:t>
+      </w:r>
+    </w:p>
+    <w:p>
+      <w:pPr>
+        <w:pStyle w:val="NoSpacing"/>
+      </w:pPr>
+    </w:p>
+    <w:p>
+      <w:pPr>
+        <w:pStyle w:val="NoSpacing"/>
+      </w:pPr>
+      <w:r>
+        <w:t xml:space="preserve">    const success = </w:t>
+      </w:r>
+      <w:proofErr w:type="gramStart"/>
+      <w:r>
+        <w:t>login(</w:t>
+      </w:r>
+      <w:proofErr w:type="gramEnd"/>
+      <w:r>
+        <w:t>username, password);</w:t>
+      </w:r>
+    </w:p>
+    <w:p>
+      <w:pPr>
+        <w:pStyle w:val="NoSpacing"/>
+      </w:pPr>
+    </w:p>
+    <w:p>
+      <w:pPr>
+        <w:pStyle w:val="NoSpacing"/>
+      </w:pPr>
+      <w:r>
+        <w:t xml:space="preserve">    if </w:t>
+      </w:r>
+      <w:proofErr w:type="gramStart"/>
+      <w:r>
+        <w:t>(!success</w:t>
+      </w:r>
+      <w:proofErr w:type="gramEnd"/>
+      <w:r>
+        <w:t>) {</w:t>
+      </w:r>
+    </w:p>
+    <w:p>
+      <w:pPr>
+        <w:pStyle w:val="NoSpacing"/>
+      </w:pPr>
+      <w:r>
+        <w:t xml:space="preserve">      </w:t>
+      </w:r>
+      <w:proofErr w:type="spellStart"/>
+      <w:proofErr w:type="gramStart"/>
+      <w:r>
+        <w:t>setError</w:t>
+      </w:r>
+      <w:proofErr w:type="spellEnd"/>
+      <w:r>
+        <w:t>(</w:t>
+      </w:r>
+      <w:proofErr w:type="gramEnd"/>
+      <w:r>
+        <w:t>"Invalid Credentials");</w:t>
+      </w:r>
+    </w:p>
+    <w:p>
+      <w:pPr>
+        <w:pStyle w:val="NoSpacing"/>
+      </w:pPr>
+      <w:r>
+        <w:lastRenderedPageBreak/>
+        <w:t xml:space="preserve">    } else {</w:t>
+      </w:r>
+    </w:p>
+    <w:p>
+      <w:pPr>
+        <w:pStyle w:val="NoSpacing"/>
+      </w:pPr>
+      <w:r>
+        <w:t xml:space="preserve">      </w:t>
+      </w:r>
+      <w:proofErr w:type="spellStart"/>
+      <w:proofErr w:type="gramStart"/>
+      <w:r>
+        <w:t>setError</w:t>
+      </w:r>
+      <w:proofErr w:type="spellEnd"/>
+      <w:r>
+        <w:t>(</w:t>
+      </w:r>
+      <w:proofErr w:type="gramEnd"/>
+      <w:r>
+        <w:t>"");</w:t>
+      </w:r>
+    </w:p>
+    <w:p>
+      <w:pPr>
+        <w:pStyle w:val="NoSpacing"/>
+      </w:pPr>
+      <w:r>
+        <w:t xml:space="preserve">    }</w:t>
+      </w:r>
+    </w:p>
+    <w:p>
+      <w:pPr>
+        <w:pStyle w:val="NoSpacing"/>
+      </w:pPr>
+      <w:r>
+        <w:t xml:space="preserve">  };</w:t>
+      </w:r>
+    </w:p>
+    <w:p>
+      <w:pPr>
+        <w:pStyle w:val="NoSpacing"/>
+      </w:pPr>
+    </w:p>
+    <w:p>
+      <w:pPr>
+        <w:pStyle w:val="NoSpacing"/>
+      </w:pPr>
+      <w:r>
+        <w:t xml:space="preserve">  return (</w:t>
+      </w:r>
+    </w:p>
+    <w:p>
+      <w:pPr>
+        <w:pStyle w:val="NoSpacing"/>
+      </w:pPr>
+    </w:p>
+    <w:p>
+      <w:pPr>
+        <w:pStyle w:val="NoSpacing"/>
+      </w:pPr>
+      <w:r>
+        <w:t xml:space="preserve">    &lt;form </w:t>
+      </w:r>
+      <w:proofErr w:type="spellStart"/>
+      <w:r>
+        <w:t>onSubmit</w:t>
+      </w:r>
+      <w:proofErr w:type="spellEnd"/>
+      <w:r>
+        <w:t>={</w:t>
+      </w:r>
+      <w:proofErr w:type="spellStart"/>
+      <w:r>
+        <w:t>handleSubmit</w:t>
+      </w:r>
+      <w:proofErr w:type="spellEnd"/>
+      <w:r>
+        <w:t>}&gt;</w:t>
+      </w:r>
+    </w:p>
+    <w:p>
+      <w:pPr>
+        <w:pStyle w:val="NoSpacing"/>
+      </w:pPr>
+    </w:p>
+    <w:p>
+      <w:pPr>
+        <w:pStyle w:val="NoSpacing"/>
+      </w:pPr>
+      <w:r>
+        <w:t xml:space="preserve">      &lt;h2&gt;Login&lt;/h2&gt;</w:t>
+      </w:r>
+    </w:p>
+    <w:p>
+      <w:pPr>
+        <w:pStyle w:val="NoSpacing"/>
+      </w:pPr>
+    </w:p>
+    <w:p>
+      <w:pPr>
+        <w:pStyle w:val="NoSpacing"/>
+      </w:pPr>
+      <w:r>
+        <w:t xml:space="preserve">      &lt;input</w:t>
+      </w:r>
+    </w:p>
+    <w:p>
+      <w:pPr>
+        <w:pStyle w:val="NoSpacing"/>
+      </w:pPr>
+      <w:r>
+        <w:t xml:space="preserve">        type="text"</w:t>
+      </w:r>
+    </w:p>
+    <w:p>
+      <w:pPr>
+        <w:pStyle w:val="NoSpacing"/>
+      </w:pPr>
+      <w:r>
+        <w:t xml:space="preserve">        placeholder="Username"</w:t>
+      </w:r>
+    </w:p>
+    <w:p>
+      <w:pPr>
+        <w:pStyle w:val="NoSpacing"/>
+      </w:pPr>
+      <w:r>
+        <w:t xml:space="preserve">        value={username}</w:t>
+      </w:r>
+    </w:p>
+    <w:p>
+      <w:pPr>
+        <w:pStyle w:val="NoSpacing"/>
+      </w:pPr>
+      <w:r>
+        <w:t xml:space="preserve">        </w:t>
+      </w:r>
+      <w:proofErr w:type="spellStart"/>
+      <w:r>
+        <w:t>onChange</w:t>
+      </w:r>
+      <w:proofErr w:type="spellEnd"/>
+      <w:r>
+        <w:t>={(e)=&gt;</w:t>
+      </w:r>
+      <w:proofErr w:type="spellStart"/>
+      <w:r>
+        <w:t>setUsername</w:t>
+      </w:r>
+      <w:proofErr w:type="spellEnd"/>
+      <w:r>
+        <w:t>(</w:t>
+      </w:r>
+      <w:proofErr w:type="spellStart"/>
+      <w:proofErr w:type="gramStart"/>
+      <w:r>
+        <w:t>e.target</w:t>
+      </w:r>
+      <w:proofErr w:type="gramEnd"/>
+      <w:r>
+        <w:t>.value</w:t>
+      </w:r>
+      <w:proofErr w:type="spellEnd"/>
+      <w:r>
+        <w:t>)}</w:t>
+      </w:r>
+    </w:p>
+    <w:p>
+      <w:pPr>
+        <w:pStyle w:val="NoSpacing"/>
+      </w:pPr>
+      <w:r>
+        <w:t xml:space="preserve">      /&gt;</w:t>
+      </w:r>
+    </w:p>
+    <w:p>
+      <w:pPr>
+        <w:pStyle w:val="NoSpacing"/>
+      </w:pPr>
+    </w:p>
+    <w:p>
+      <w:pPr>
+        <w:pStyle w:val="NoSpacing"/>
+      </w:pPr>
+      <w:r>
+        <w:t xml:space="preserve">      &lt;</w:t>
+      </w:r>
+      <w:proofErr w:type="spellStart"/>
+      <w:r>
+        <w:t>br</w:t>
+      </w:r>
+      <w:proofErr w:type="spellEnd"/>
+      <w:r>
+        <w:t xml:space="preserve"> /&gt;&lt;</w:t>
+      </w:r>
+      <w:proofErr w:type="spellStart"/>
+      <w:r>
+        <w:t>br</w:t>
+      </w:r>
+      <w:proofErr w:type="spellEnd"/>
+      <w:r>
+        <w:t xml:space="preserve"> /&gt;</w:t>
+      </w:r>
+    </w:p>
+    <w:p>
+      <w:pPr>
+        <w:pStyle w:val="NoSpacing"/>
+      </w:pPr>
+    </w:p>
+    <w:p>
+      <w:pPr>
+        <w:pStyle w:val="NoSpacing"/>
+      </w:pPr>
+      <w:r>
+        <w:t xml:space="preserve">      &lt;input</w:t>
+      </w:r>
+    </w:p>
+    <w:p>
+      <w:pPr>
+        <w:pStyle w:val="NoSpacing"/>
+      </w:pPr>
+      <w:r>
+        <w:t xml:space="preserve">        type="password"</w:t>
+      </w:r>
+    </w:p>
+    <w:p>
+      <w:pPr>
+        <w:pStyle w:val="NoSpacing"/>
+      </w:pPr>
+      <w:r>
+        <w:t xml:space="preserve">        placeholder="Password"</w:t>
+      </w:r>
+    </w:p>
+    <w:p>
+      <w:pPr>
+        <w:pStyle w:val="NoSpacing"/>
+      </w:pPr>
+      <w:r>
+        <w:t xml:space="preserve">        value={password}</w:t>
+      </w:r>
+    </w:p>
+    <w:p>
+      <w:pPr>
+        <w:pStyle w:val="NoSpacing"/>
+      </w:pPr>
+      <w:r>
+        <w:t xml:space="preserve">        </w:t>
+      </w:r>
+      <w:proofErr w:type="spellStart"/>
+      <w:r>
+        <w:t>onChange</w:t>
+      </w:r>
+      <w:proofErr w:type="spellEnd"/>
+      <w:r>
+        <w:t>={(e)=&gt;</w:t>
+      </w:r>
+      <w:proofErr w:type="spellStart"/>
+      <w:r>
+        <w:t>setPassword</w:t>
+      </w:r>
+      <w:proofErr w:type="spellEnd"/>
+      <w:r>
+        <w:t>(</w:t>
+      </w:r>
+      <w:proofErr w:type="spellStart"/>
+      <w:proofErr w:type="gramStart"/>
+      <w:r>
+        <w:t>e.target</w:t>
+      </w:r>
+      <w:proofErr w:type="gramEnd"/>
+      <w:r>
+        <w:t>.value</w:t>
+      </w:r>
+      <w:proofErr w:type="spellEnd"/>
+      <w:r>
+        <w:t>)}</w:t>
+      </w:r>
+    </w:p>
+    <w:p>
+      <w:pPr>
+        <w:pStyle w:val="NoSpacing"/>
+      </w:pPr>
+      <w:r>
+        <w:t xml:space="preserve">      /&gt;</w:t>
+      </w:r>
+    </w:p>
+    <w:p>
+      <w:pPr>
+        <w:pStyle w:val="NoSpacing"/>
+      </w:pPr>
+    </w:p>
+    <w:p>
+      <w:pPr>
+        <w:pStyle w:val="NoSpacing"/>
+      </w:pPr>
+      <w:r>
+        <w:t xml:space="preserve">      &lt;</w:t>
+      </w:r>
+      <w:proofErr w:type="spellStart"/>
+      <w:r>
+        <w:t>br</w:t>
+      </w:r>
+      <w:proofErr w:type="spellEnd"/>
+      <w:r>
+        <w:t xml:space="preserve"> /&gt;&lt;</w:t>
+      </w:r>
+      <w:proofErr w:type="spellStart"/>
+      <w:r>
+        <w:t>br</w:t>
+      </w:r>
+      <w:proofErr w:type="spellEnd"/>
+      <w:r>
+        <w:t xml:space="preserve"> /&gt;</w:t>
+      </w:r>
+    </w:p>
+    <w:p>
+      <w:pPr>
+        <w:pStyle w:val="NoSpacing"/>
+      </w:pPr>
+    </w:p>
+    <w:p>
+      <w:pPr>
+        <w:pStyle w:val="NoSpacing"/>
+      </w:pPr>
+      <w:r>
+        <w:t xml:space="preserve">      &lt;button&gt;</w:t>
+      </w:r>
+    </w:p>
+    <w:p>
+      <w:pPr>
+        <w:pStyle w:val="NoSpacing"/>
+      </w:pPr>
+      <w:r>
+        <w:t xml:space="preserve">        Login</w:t>
+      </w:r>
+    </w:p>
+    <w:p>
+      <w:pPr>
+        <w:pStyle w:val="NoSpacing"/>
+      </w:pPr>
+      <w:r>
+        <w:t xml:space="preserve">      &lt;/button&gt;</w:t>
+      </w:r>
+    </w:p>
+    <w:p>
+      <w:pPr>
+        <w:pStyle w:val="NoSpacing"/>
+      </w:pPr>
+    </w:p>
+    <w:p>
+      <w:pPr>
+        <w:pStyle w:val="NoSpacing"/>
+      </w:pPr>
+      <w:r>
+        <w:t xml:space="preserve">      &lt;</w:t>
+      </w:r>
+      <w:proofErr w:type="spellStart"/>
+      <w:r>
+        <w:t>br</w:t>
+      </w:r>
+      <w:proofErr w:type="spellEnd"/>
+      <w:r>
+        <w:t xml:space="preserve"> /&gt;</w:t>
+      </w:r>
+    </w:p>
+    <w:p>
+      <w:pPr>
+        <w:pStyle w:val="NoSpacing"/>
+      </w:pPr>
+    </w:p>
+    <w:p>
+      <w:pPr>
+        <w:pStyle w:val="NoSpacing"/>
+      </w:pPr>
+      <w:r>
+        <w:t xml:space="preserve">      &lt;p style={{</w:t>
+      </w:r>
+      <w:proofErr w:type="spellStart"/>
+      <w:r>
+        <w:t>color</w:t>
+      </w:r>
+      <w:proofErr w:type="spellEnd"/>
+      <w:r>
+        <w:t>:"red"}}&gt;</w:t>
+      </w:r>
+    </w:p>
+    <w:p>
+      <w:pPr>
+        <w:pStyle w:val="NoSpacing"/>
+      </w:pPr>
+      <w:r>
+        <w:t xml:space="preserve">        {error}</w:t>
+      </w:r>
+    </w:p>
+    <w:p>
+      <w:pPr>
+        <w:pStyle w:val="NoSpacing"/>
+      </w:pPr>
+      <w:r>
+        <w:t xml:space="preserve">      &lt;/p&gt;</w:t>
+      </w:r>
+    </w:p>
+    <w:p>
+      <w:pPr>
+        <w:pStyle w:val="NoSpacing"/>
+      </w:pPr>
+    </w:p>
+    <w:p>
+      <w:pPr>
+        <w:pStyle w:val="NoSpacing"/>
+      </w:pPr>
+      <w:r>
+        <w:t xml:space="preserve">    &lt;/form&gt;</w:t>
+      </w:r>
+    </w:p>
+    <w:p>
+      <w:pPr>
+        <w:pStyle w:val="NoSpacing"/>
+      </w:pPr>
+    </w:p>
+    <w:p>
+      <w:pPr>
+        <w:pStyle w:val="NoSpacing"/>
+      </w:pPr>
+      <w:r>
+        <w:t xml:space="preserve">  );</w:t>
+      </w:r>
+    </w:p>
+    <w:p>
+      <w:pPr>
+        <w:pStyle w:val="NoSpacing"/>
+      </w:pPr>
+      <w:r>
+        <w:t>};</w:t>
+      </w:r>
+    </w:p>
+    <w:p>
+      <w:pPr>
+        <w:pStyle w:val="NoSpacing"/>
+      </w:pPr>
+    </w:p>
+    <w:p>
+      <w:pPr>
+        <w:pStyle w:val="NoSpacing"/>
+      </w:pPr>
+      <w:r>
+        <w:t>export default Login;</w:t>
+      </w:r>
+    </w:p>
+    <w:p>
+      <w:pPr>
+        <w:pStyle w:val="NoSpacing"/>
+      </w:pPr>
+    </w:p>
+    <w:p>
+      <w:pPr>
+        <w:pStyle w:val="NoSpacing"/>
+      </w:pPr>
+    </w:p>
+    <w:p>
+      <w:pPr>
+        <w:pStyle w:val="NoSpacing"/>
+      </w:pPr>
+    </w:p>
+    <w:p>
+      <w:pPr>
+        <w:pStyle w:val="NoSpacing"/>
+      </w:pPr>
+    </w:p>
+    <w:p>
+      <w:pPr>
+        <w:pStyle w:val="NoSpacing"/>
+      </w:pPr>
+    </w:p>
+    <w:p>
+      <w:pPr>
+        <w:pStyle w:val="NoSpacing"/>
+        <w:rPr>
+          <w:b/>
+          <w:sz w:val="48"/>
+        </w:rPr>
+      </w:pPr>
+      <w:r>
+        <w:rPr>
+          <w:b/>
+        </w:rPr>
+        <w:lastRenderedPageBreak/>
+        <w:t xml:space="preserve">Step </w:t>
+      </w:r>
+      <w:proofErr w:type="gramStart"/>
+      <w:r>
+        <w:rPr>
+          <w:b/>
+        </w:rPr>
+        <w:t>4 :</w:t>
+      </w:r>
+      <w:proofErr w:type="gramEnd"/>
+      <w:r>
+        <w:rPr>
+          <w:b/>
+        </w:rPr>
+        <w:t xml:space="preserve"> Dashboard</w:t>
+      </w:r>
+    </w:p>
+    <w:p>
+      <w:pPr>
+        <w:pStyle w:val="NoSpacing"/>
+      </w:pPr>
+      <w:r>
+        <w:t>components/</w:t>
+      </w:r>
+      <w:proofErr w:type="spellStart"/>
+      <w:r>
+        <w:t>Dashboard.jsx</w:t>
+      </w:r>
+      <w:proofErr w:type="spellEnd"/>
+    </w:p>
+    <w:p>
+      <w:pPr>
+        <w:pStyle w:val="NoSpacing"/>
+        <w:rPr>
+          <w:rStyle w:val="HTMLCode"/>
+          <w:rFonts w:eastAsiaTheme="minorHAnsi"/>
+        </w:rPr>
+      </w:pPr>
+      <w:r>
+        <w:rPr>
+          <w:rStyle w:val="g"/>
+        </w:rPr>
+        <w:t>import</w:t>
+      </w:r>
+      <w:r>
+        <w:rPr>
+          <w:rStyle w:val="HTMLCode"/>
+          <w:rFonts w:eastAsiaTheme="minorHAnsi"/>
+        </w:rPr>
+        <w:t xml:space="preserve"> </w:t>
+      </w:r>
+      <w:proofErr w:type="gramStart"/>
+      <w:r>
+        <w:rPr>
+          <w:rStyle w:val="HTMLCode"/>
+          <w:rFonts w:eastAsiaTheme="minorHAnsi"/>
+        </w:rPr>
+        <w:t xml:space="preserve">{ </w:t>
+      </w:r>
+      <w:proofErr w:type="spellStart"/>
+      <w:r>
+        <w:rPr>
+          <w:rStyle w:val="m"/>
+        </w:rPr>
+        <w:t>useAuth</w:t>
+      </w:r>
+      <w:proofErr w:type="spellEnd"/>
+      <w:proofErr w:type="gramEnd"/>
+      <w:r>
+        <w:rPr>
+          <w:rStyle w:val="HTMLCode"/>
+          <w:rFonts w:eastAsiaTheme="minorHAnsi"/>
+        </w:rPr>
+        <w:t xml:space="preserve"> } </w:t>
+      </w:r>
+      <w:r>
+        <w:rPr>
+          <w:rStyle w:val="g"/>
+        </w:rPr>
+        <w:t>from</w:t>
+      </w:r>
+      <w:r>
+        <w:rPr>
+          <w:rStyle w:val="HTMLCode"/>
+          <w:rFonts w:eastAsiaTheme="minorHAnsi"/>
+        </w:rPr>
+        <w:t xml:space="preserve"> </w:t>
+      </w:r>
+      <w:r>
+        <w:rPr>
+          <w:rStyle w:val="k"/>
+        </w:rPr>
+        <w:t>"../context/</w:t>
+      </w:r>
+      <w:proofErr w:type="spellStart"/>
+      <w:r>
+        <w:rPr>
+          <w:rStyle w:val="k"/>
+        </w:rPr>
+        <w:t>AuthContext</w:t>
+      </w:r>
+      <w:proofErr w:type="spellEnd"/>
+      <w:r>
+        <w:rPr>
+          <w:rStyle w:val="k"/>
+        </w:rPr>
+        <w:t>"</w:t>
+      </w:r>
+      <w:r>
+        <w:rPr>
+          <w:rStyle w:val="HTMLCode"/>
+          <w:rFonts w:eastAsiaTheme="minorHAnsi"/>
+        </w:rPr>
+        <w:t>;</w:t>
+      </w:r>
+    </w:p>
+    <w:p>
+      <w:pPr>
+        <w:pStyle w:val="NoSpacing"/>
+        <w:rPr>
+          <w:rStyle w:val="HTMLCode"/>
+          <w:rFonts w:eastAsiaTheme="minorHAnsi"/>
+        </w:rPr>
+      </w:pPr>
+    </w:p>
+    <w:p>
+      <w:pPr>
+        <w:pStyle w:val="NoSpacing"/>
+        <w:rPr>
+          <w:rStyle w:val="HTMLCode"/>
+          <w:rFonts w:ascii="Times New Roman" w:eastAsiaTheme="minorHAnsi" w:hAnsi="Times New Roman" w:cstheme="minorBidi"/>
+          <w:sz w:val="24"/>
+          <w:szCs w:val="22"/>
+        </w:rPr>
+      </w:pPr>
+      <w:r>
+        <w:rPr>
+          <w:rStyle w:val="g"/>
+        </w:rPr>
+        <w:t>const</w:t>
+      </w:r>
+      <w:r>
+        <w:rPr>
+          <w:rStyle w:val="HTMLCode"/>
+          <w:rFonts w:ascii="Times New Roman" w:eastAsiaTheme="minorHAnsi" w:hAnsi="Times New Roman" w:cstheme="minorBidi"/>
+          <w:sz w:val="24"/>
+          <w:szCs w:val="22"/>
+        </w:rPr>
+        <w:t xml:space="preserve"> </w:t>
+      </w:r>
+      <w:r>
+        <w:rPr>
+          <w:rStyle w:val="m"/>
+        </w:rPr>
+        <w:t>Dashboard</w:t>
+      </w:r>
+      <w:r>
+        <w:rPr>
+          <w:rStyle w:val="HTMLCode"/>
+          <w:rFonts w:ascii="Times New Roman" w:eastAsiaTheme="minorHAnsi" w:hAnsi="Times New Roman" w:cstheme="minorBidi"/>
+          <w:sz w:val="24"/>
+          <w:szCs w:val="22"/>
+        </w:rPr>
+        <w:t xml:space="preserve"> </w:t>
+      </w:r>
+      <w:r>
+        <w:rPr>
+          <w:rStyle w:val="g"/>
+        </w:rPr>
+        <w:t>=</w:t>
+      </w:r>
+      <w:r>
+        <w:rPr>
+          <w:rStyle w:val="HTMLCode"/>
+          <w:rFonts w:ascii="Times New Roman" w:eastAsiaTheme="minorHAnsi" w:hAnsi="Times New Roman" w:cstheme="minorBidi"/>
+          <w:sz w:val="24"/>
+          <w:szCs w:val="22"/>
+        </w:rPr>
+        <w:t xml:space="preserve"> () =&gt; {</w:t>
+      </w:r>
+    </w:p>
+    <w:p>
+      <w:pPr>
+        <w:pStyle w:val="NoSpacing"/>
+        <w:rPr>
+          <w:rStyle w:val="HTMLCode"/>
+          <w:rFonts w:ascii="Times New Roman" w:eastAsiaTheme="minorHAnsi" w:hAnsi="Times New Roman" w:cstheme="minorBidi"/>
+          <w:sz w:val="24"/>
+          <w:szCs w:val="22"/>
+        </w:rPr>
+      </w:pPr>
+      <w:r>
+        <w:rPr>
+          <w:rStyle w:val="HTMLCode"/>
+          <w:rFonts w:ascii="Times New Roman" w:eastAsiaTheme="minorHAnsi" w:hAnsi="Times New Roman" w:cstheme="minorBidi"/>
+          <w:sz w:val="24"/>
+          <w:szCs w:val="22"/>
+        </w:rPr>
+        <w:t xml:space="preserve">  </w:t>
+      </w:r>
+      <w:r>
+        <w:rPr>
+          <w:rStyle w:val="g"/>
+        </w:rPr>
+        <w:t>const</w:t>
+      </w:r>
+      <w:r>
+        <w:rPr>
+          <w:rStyle w:val="HTMLCode"/>
+          <w:rFonts w:ascii="Times New Roman" w:eastAsiaTheme="minorHAnsi" w:hAnsi="Times New Roman" w:cstheme="minorBidi"/>
+          <w:sz w:val="24"/>
+          <w:szCs w:val="22"/>
+        </w:rPr>
+        <w:t xml:space="preserve"> </w:t>
+      </w:r>
+      <w:proofErr w:type="gramStart"/>
+      <w:r>
+        <w:rPr>
+          <w:rStyle w:val="HTMLCode"/>
+          <w:rFonts w:ascii="Times New Roman" w:eastAsiaTheme="minorHAnsi" w:hAnsi="Times New Roman" w:cstheme="minorBidi"/>
+          <w:sz w:val="24"/>
+          <w:szCs w:val="22"/>
+        </w:rPr>
+        <w:t>{ user</w:t>
+      </w:r>
+      <w:proofErr w:type="gramEnd"/>
+      <w:r>
+        <w:rPr>
+          <w:rStyle w:val="HTMLCode"/>
+          <w:rFonts w:ascii="Times New Roman" w:eastAsiaTheme="minorHAnsi" w:hAnsi="Times New Roman" w:cstheme="minorBidi"/>
+          <w:sz w:val="24"/>
+          <w:szCs w:val="22"/>
+        </w:rPr>
+        <w:t xml:space="preserve"> } </w:t>
+      </w:r>
+      <w:r>
+        <w:rPr>
+          <w:rStyle w:val="g"/>
+        </w:rPr>
+        <w:t>=</w:t>
+      </w:r>
+      <w:r>
+        <w:rPr>
+          <w:rStyle w:val="HTMLCode"/>
+          <w:rFonts w:ascii="Times New Roman" w:eastAsiaTheme="minorHAnsi" w:hAnsi="Times New Roman" w:cstheme="minorBidi"/>
+          <w:sz w:val="24"/>
+          <w:szCs w:val="22"/>
+        </w:rPr>
+        <w:t xml:space="preserve"> </w:t>
+      </w:r>
+      <w:proofErr w:type="spellStart"/>
+      <w:r>
+        <w:rPr>
+          <w:rStyle w:val="m"/>
+        </w:rPr>
+        <w:t>useAuth</w:t>
+      </w:r>
+      <w:proofErr w:type="spellEnd"/>
+      <w:r>
+        <w:rPr>
+          <w:rStyle w:val="HTMLCode"/>
+          <w:rFonts w:ascii="Times New Roman" w:eastAsiaTheme="minorHAnsi" w:hAnsi="Times New Roman" w:cstheme="minorBidi"/>
+          <w:sz w:val="24"/>
+          <w:szCs w:val="22"/>
+        </w:rPr>
+        <w:t>();</w:t>
+      </w:r>
+    </w:p>
+    <w:p>
+      <w:pPr>
+        <w:pStyle w:val="NoSpacing"/>
+        <w:rPr>
+          <w:rStyle w:val="HTMLCode"/>
+          <w:rFonts w:ascii="Times New Roman" w:eastAsiaTheme="minorHAnsi" w:hAnsi="Times New Roman" w:cstheme="minorBidi"/>
+          <w:sz w:val="24"/>
+          <w:szCs w:val="22"/>
+        </w:rPr>
+      </w:pPr>
+    </w:p>
+    <w:p>
+      <w:pPr>
+        <w:pStyle w:val="NoSpacing"/>
+        <w:rPr>
+          <w:rStyle w:val="HTMLCode"/>
+          <w:rFonts w:ascii="Times New Roman" w:eastAsiaTheme="minorHAnsi" w:hAnsi="Times New Roman" w:cstheme="minorBidi"/>
+          <w:sz w:val="24"/>
+          <w:szCs w:val="22"/>
+        </w:rPr>
+      </w:pPr>
+      <w:r>
+        <w:rPr>
+          <w:rStyle w:val="HTMLCode"/>
+          <w:rFonts w:ascii="Times New Roman" w:eastAsiaTheme="minorHAnsi" w:hAnsi="Times New Roman" w:cstheme="minorBidi"/>
+          <w:sz w:val="24"/>
+          <w:szCs w:val="22"/>
+        </w:rPr>
+        <w:t xml:space="preserve">  </w:t>
+      </w:r>
+      <w:r>
+        <w:rPr>
+          <w:rStyle w:val="g"/>
+        </w:rPr>
+        <w:t>return</w:t>
+      </w:r>
+      <w:r>
+        <w:rPr>
+          <w:rStyle w:val="HTMLCode"/>
+          <w:rFonts w:ascii="Times New Roman" w:eastAsiaTheme="minorHAnsi" w:hAnsi="Times New Roman" w:cstheme="minorBidi"/>
+          <w:sz w:val="24"/>
+          <w:szCs w:val="22"/>
+        </w:rPr>
+        <w:t xml:space="preserve"> (</w:t>
+      </w:r>
+    </w:p>
+    <w:p>
+      <w:pPr>
+        <w:pStyle w:val="NoSpacing"/>
+        <w:rPr>
+          <w:rStyle w:val="HTMLCode"/>
+          <w:rFonts w:ascii="Times New Roman" w:eastAsiaTheme="minorHAnsi" w:hAnsi="Times New Roman" w:cstheme="minorBidi"/>
+          <w:sz w:val="24"/>
+          <w:szCs w:val="22"/>
+        </w:rPr>
+      </w:pPr>
+      <w:r>
+        <w:rPr>
+          <w:rStyle w:val="HTMLCode"/>
+          <w:rFonts w:ascii="Times New Roman" w:eastAsiaTheme="minorHAnsi" w:hAnsi="Times New Roman" w:cstheme="minorBidi"/>
+          <w:sz w:val="24"/>
+          <w:szCs w:val="22"/>
+        </w:rPr>
+        <w:t xml:space="preserve">    </w:t>
+      </w:r>
+      <w:r>
+        <w:rPr>
+          <w:rStyle w:val="o"/>
+        </w:rPr>
+        <w:t>&lt;div&gt;</w:t>
+      </w:r>
+    </w:p>
+    <w:p>
+      <w:pPr>
+        <w:pStyle w:val="NoSpacing"/>
+        <w:rPr>
+          <w:rStyle w:val="HTMLCode"/>
+          <w:rFonts w:ascii="Times New Roman" w:eastAsiaTheme="minorHAnsi" w:hAnsi="Times New Roman" w:cstheme="minorBidi"/>
+          <w:sz w:val="24"/>
+          <w:szCs w:val="22"/>
+        </w:rPr>
+      </w:pPr>
+      <w:r>
+        <w:rPr>
+          <w:rStyle w:val="HTMLCode"/>
+          <w:rFonts w:ascii="Times New Roman" w:eastAsiaTheme="minorHAnsi" w:hAnsi="Times New Roman" w:cstheme="minorBidi"/>
+          <w:sz w:val="24"/>
+          <w:szCs w:val="22"/>
+        </w:rPr>
+        <w:t xml:space="preserve">      </w:t>
+      </w:r>
+      <w:r>
+        <w:rPr>
+          <w:rStyle w:val="o"/>
+        </w:rPr>
+        <w:t>&lt;h1&gt;</w:t>
+      </w:r>
+    </w:p>
+    <w:p>
+      <w:pPr>
+        <w:pStyle w:val="NoSpacing"/>
+        <w:rPr>
+          <w:rStyle w:val="HTMLCode"/>
+          <w:rFonts w:ascii="Times New Roman" w:eastAsiaTheme="minorHAnsi" w:hAnsi="Times New Roman" w:cstheme="minorBidi"/>
+          <w:sz w:val="24"/>
+          <w:szCs w:val="22"/>
+        </w:rPr>
+      </w:pPr>
+      <w:r>
+        <w:rPr>
+          <w:rStyle w:val="HTMLCode"/>
+          <w:rFonts w:ascii="Times New Roman" w:eastAsiaTheme="minorHAnsi" w:hAnsi="Times New Roman" w:cstheme="minorBidi"/>
+          <w:sz w:val="24"/>
+          <w:szCs w:val="22"/>
+        </w:rPr>
+        <w:t xml:space="preserve">        Welcome {</w:t>
+      </w:r>
+      <w:proofErr w:type="spellStart"/>
+      <w:proofErr w:type="gramStart"/>
+      <w:r>
+        <w:rPr>
+          <w:rStyle w:val="m"/>
+        </w:rPr>
+        <w:t>user</w:t>
+      </w:r>
+      <w:r>
+        <w:rPr>
+          <w:rStyle w:val="g"/>
+        </w:rPr>
+        <w:t>.</w:t>
+      </w:r>
+      <w:r>
+        <w:rPr>
+          <w:rStyle w:val="HTMLCode"/>
+          <w:rFonts w:ascii="Times New Roman" w:eastAsiaTheme="minorHAnsi" w:hAnsi="Times New Roman" w:cstheme="minorBidi"/>
+          <w:sz w:val="24"/>
+          <w:szCs w:val="22"/>
+        </w:rPr>
+        <w:t>username</w:t>
+      </w:r>
+      <w:proofErr w:type="spellEnd"/>
+      <w:proofErr w:type="gramEnd"/>
+      <w:r>
+        <w:rPr>
+          <w:rStyle w:val="HTMLCode"/>
+          <w:rFonts w:ascii="Times New Roman" w:eastAsiaTheme="minorHAnsi" w:hAnsi="Times New Roman" w:cstheme="minorBidi"/>
+          <w:sz w:val="24"/>
+          <w:szCs w:val="22"/>
+        </w:rPr>
+        <w:t>}</w:t>
+      </w:r>
+    </w:p>
+    <w:p>
+      <w:pPr>
+        <w:pStyle w:val="NoSpacing"/>
+        <w:rPr>
+          <w:rStyle w:val="HTMLCode"/>
+          <w:rFonts w:ascii="Times New Roman" w:eastAsiaTheme="minorHAnsi" w:hAnsi="Times New Roman" w:cstheme="minorBidi"/>
+          <w:sz w:val="24"/>
+          <w:szCs w:val="22"/>
+        </w:rPr>
+      </w:pPr>
+      <w:r>
+        <w:rPr>
+          <w:rStyle w:val="HTMLCode"/>
+          <w:rFonts w:ascii="Times New Roman" w:eastAsiaTheme="minorHAnsi" w:hAnsi="Times New Roman" w:cstheme="minorBidi"/>
+          <w:sz w:val="24"/>
+          <w:szCs w:val="22"/>
+        </w:rPr>
+        <w:t xml:space="preserve">      </w:t>
+      </w:r>
+      <w:r>
+        <w:rPr>
+          <w:rStyle w:val="o"/>
+        </w:rPr>
+        <w:t>&lt;/h1&gt;</w:t>
+      </w:r>
+    </w:p>
+    <w:p>
+      <w:pPr>
+        <w:pStyle w:val="NoSpacing"/>
+        <w:rPr>
+          <w:rStyle w:val="HTMLCode"/>
+          <w:rFonts w:ascii="Times New Roman" w:eastAsiaTheme="minorHAnsi" w:hAnsi="Times New Roman" w:cstheme="minorBidi"/>
+          <w:sz w:val="24"/>
+          <w:szCs w:val="22"/>
+        </w:rPr>
+      </w:pPr>
+      <w:r>
+        <w:rPr>
+          <w:rStyle w:val="HTMLCode"/>
+          <w:rFonts w:ascii="Times New Roman" w:eastAsiaTheme="minorHAnsi" w:hAnsi="Times New Roman" w:cstheme="minorBidi"/>
+          <w:sz w:val="24"/>
+          <w:szCs w:val="22"/>
+        </w:rPr>
+        <w:t xml:space="preserve">    </w:t>
+      </w:r>
+      <w:r>
+        <w:rPr>
+          <w:rStyle w:val="o"/>
+        </w:rPr>
+        <w:t>&lt;/div&gt;</w:t>
+      </w:r>
+    </w:p>
+    <w:p>
+      <w:pPr>
+        <w:pStyle w:val="NoSpacing"/>
+        <w:rPr>
+          <w:rStyle w:val="HTMLCode"/>
+          <w:rFonts w:ascii="Times New Roman" w:eastAsiaTheme="minorHAnsi" w:hAnsi="Times New Roman" w:cstheme="minorBidi"/>
+          <w:sz w:val="24"/>
+          <w:szCs w:val="22"/>
+        </w:rPr>
+      </w:pPr>
+    </w:p>
+    <w:p>
+      <w:pPr>
+        <w:pStyle w:val="NoSpacing"/>
+        <w:rPr>
+          <w:rStyle w:val="HTMLCode"/>
+          <w:rFonts w:ascii="Times New Roman" w:eastAsiaTheme="minorHAnsi" w:hAnsi="Times New Roman" w:cstheme="minorBidi"/>
+          <w:sz w:val="24"/>
+          <w:szCs w:val="22"/>
+        </w:rPr>
+      </w:pPr>
+      <w:r>
+        <w:rPr>
+          <w:rStyle w:val="HTMLCode"/>
+          <w:rFonts w:ascii="Times New Roman" w:eastAsiaTheme="minorHAnsi" w:hAnsi="Times New Roman" w:cstheme="minorBidi"/>
+          <w:sz w:val="24"/>
+          <w:szCs w:val="22"/>
+        </w:rPr>
+        <w:t xml:space="preserve">  );</w:t>
+      </w:r>
+    </w:p>
+    <w:p>
+      <w:pPr>
+        <w:pStyle w:val="NoSpacing"/>
+        <w:rPr>
+          <w:rStyle w:val="HTMLCode"/>
+          <w:rFonts w:ascii="Times New Roman" w:eastAsiaTheme="minorHAnsi" w:hAnsi="Times New Roman" w:cstheme="minorBidi"/>
+          <w:sz w:val="24"/>
+          <w:szCs w:val="22"/>
+        </w:rPr>
+      </w:pPr>
+      <w:r>
+        <w:rPr>
+          <w:rStyle w:val="HTMLCode"/>
+          <w:rFonts w:ascii="Times New Roman" w:eastAsiaTheme="minorHAnsi" w:hAnsi="Times New Roman" w:cstheme="minorBidi"/>
+          <w:sz w:val="24"/>
+          <w:szCs w:val="22"/>
+        </w:rPr>
+        <w:t>};</w:t>
+      </w:r>
+    </w:p>
+    <w:p>
+      <w:pPr>
+        <w:pStyle w:val="NoSpacing"/>
+        <w:rPr>
+          <w:rStyle w:val="HTMLCode"/>
+          <w:rFonts w:eastAsiaTheme="minorHAnsi"/>
+        </w:rPr>
+      </w:pPr>
+    </w:p>
+    <w:p>
+      <w:pPr>
+        <w:pStyle w:val="NoSpacing"/>
+      </w:pPr>
+      <w:r>
+        <w:rPr>
+          <w:rStyle w:val="g"/>
+        </w:rPr>
+        <w:t>export</w:t>
+      </w:r>
+      <w:r>
+        <w:rPr>
+          <w:rStyle w:val="HTMLCode"/>
+          <w:rFonts w:eastAsiaTheme="minorHAnsi"/>
+        </w:rPr>
+        <w:t xml:space="preserve"> </w:t>
+      </w:r>
+      <w:r>
+        <w:rPr>
+          <w:rStyle w:val="g"/>
+        </w:rPr>
+        <w:t>default</w:t>
+      </w:r>
+      <w:r>
+        <w:rPr>
+          <w:rStyle w:val="HTMLCode"/>
+          <w:rFonts w:eastAsiaTheme="minorHAnsi"/>
+        </w:rPr>
+        <w:t xml:space="preserve"> </w:t>
+      </w:r>
+      <w:r>
+        <w:rPr>
+          <w:rStyle w:val="m"/>
+        </w:rPr>
+        <w:t>Dashboard</w:t>
+      </w:r>
+      <w:r>
+        <w:rPr>
+          <w:rStyle w:val="HTMLCode"/>
+          <w:rFonts w:eastAsiaTheme="minorHAnsi"/>
+        </w:rPr>
+        <w:t>;</w:t>
+      </w:r>
+    </w:p>
+    <w:p>
+      <w:pPr>
+        <w:pStyle w:val="NoSpacing"/>
+      </w:pPr>
+    </w:p>
+    <w:p>
+      <w:pPr>
+        <w:pStyle w:val="NoSpacing"/>
+        <w:rPr>
+          <w:b/>
+        </w:rPr>
+      </w:pPr>
+      <w:r>
+        <w:rPr>
+          <w:b/>
+        </w:rPr>
+        <w:t xml:space="preserve">Step </w:t>
+      </w:r>
+      <w:proofErr w:type="gramStart"/>
+      <w:r>
+        <w:rPr>
+          <w:b/>
+        </w:rPr>
+        <w:t>5 :</w:t>
+      </w:r>
+      <w:proofErr w:type="gramEnd"/>
+      <w:r>
+        <w:rPr>
+          <w:b/>
+        </w:rPr>
+        <w:t xml:space="preserve"> Navbar</w:t>
+      </w:r>
+    </w:p>
+    <w:p>
+      <w:pPr>
+        <w:pStyle w:val="NoSpacing"/>
+        <w:rPr>
+          <w:rStyle w:val="HTMLCode"/>
+          <w:rFonts w:eastAsiaTheme="minorHAnsi"/>
+        </w:rPr>
+      </w:pPr>
+      <w:r>
+        <w:rPr>
+          <w:rStyle w:val="g"/>
+        </w:rPr>
+        <w:t>import</w:t>
+      </w:r>
+      <w:r>
+        <w:rPr>
+          <w:rStyle w:val="HTMLCode"/>
+          <w:rFonts w:eastAsiaTheme="minorHAnsi"/>
+        </w:rPr>
+        <w:t xml:space="preserve"> </w:t>
+      </w:r>
+      <w:proofErr w:type="gramStart"/>
+      <w:r>
+        <w:rPr>
+          <w:rStyle w:val="HTMLCode"/>
+          <w:rFonts w:eastAsiaTheme="minorHAnsi"/>
+        </w:rPr>
+        <w:t xml:space="preserve">{ </w:t>
+      </w:r>
+      <w:proofErr w:type="spellStart"/>
+      <w:r>
+        <w:rPr>
+          <w:rStyle w:val="m"/>
+        </w:rPr>
+        <w:t>useAuth</w:t>
+      </w:r>
+      <w:proofErr w:type="spellEnd"/>
+      <w:proofErr w:type="gramEnd"/>
+      <w:r>
+        <w:rPr>
+          <w:rStyle w:val="HTMLCode"/>
+          <w:rFonts w:eastAsiaTheme="minorHAnsi"/>
+        </w:rPr>
+        <w:t xml:space="preserve"> } </w:t>
+      </w:r>
+      <w:r>
+        <w:rPr>
+          <w:rStyle w:val="g"/>
+        </w:rPr>
+        <w:t>from</w:t>
+      </w:r>
+      <w:r>
+        <w:rPr>
+          <w:rStyle w:val="HTMLCode"/>
+          <w:rFonts w:eastAsiaTheme="minorHAnsi"/>
+        </w:rPr>
+        <w:t xml:space="preserve"> </w:t>
+      </w:r>
+      <w:r>
+        <w:rPr>
+          <w:rStyle w:val="k"/>
+        </w:rPr>
+        <w:t>"../context/</w:t>
+      </w:r>
+      <w:proofErr w:type="spellStart"/>
+      <w:r>
+        <w:rPr>
+          <w:rStyle w:val="k"/>
+        </w:rPr>
+        <w:t>AuthContext</w:t>
+      </w:r>
+      <w:proofErr w:type="spellEnd"/>
+      <w:r>
+        <w:rPr>
+          <w:rStyle w:val="k"/>
+        </w:rPr>
+        <w:t>"</w:t>
+      </w:r>
+      <w:r>
+        <w:rPr>
+          <w:rStyle w:val="HTMLCode"/>
+          <w:rFonts w:eastAsiaTheme="minorHAnsi"/>
+        </w:rPr>
+        <w:t>;</w:t>
+      </w:r>
+    </w:p>
+    <w:p>
+      <w:pPr>
+        <w:pStyle w:val="NoSpacing"/>
+        <w:rPr>
+          <w:rStyle w:val="HTMLCode"/>
+          <w:rFonts w:eastAsiaTheme="minorHAnsi"/>
+        </w:rPr>
+      </w:pPr>
+    </w:p>
+    <w:p>
+      <w:pPr>
+        <w:pStyle w:val="NoSpacing"/>
+        <w:rPr>
+          <w:rStyle w:val="HTMLCode"/>
+          <w:rFonts w:ascii="Times New Roman" w:eastAsiaTheme="minorHAnsi" w:hAnsi="Times New Roman" w:cstheme="minorBidi"/>
+          <w:sz w:val="24"/>
+          <w:szCs w:val="22"/>
+        </w:rPr>
+      </w:pPr>
+      <w:r>
+        <w:rPr>
+          <w:rStyle w:val="g"/>
+        </w:rPr>
+        <w:t>const</w:t>
+      </w:r>
+      <w:r>
+        <w:rPr>
+          <w:rStyle w:val="HTMLCode"/>
+          <w:rFonts w:ascii="Times New Roman" w:eastAsiaTheme="minorHAnsi" w:hAnsi="Times New Roman" w:cstheme="minorBidi"/>
+          <w:sz w:val="24"/>
+          <w:szCs w:val="22"/>
+        </w:rPr>
+        <w:t xml:space="preserve"> </w:t>
+      </w:r>
+      <w:r>
+        <w:rPr>
+          <w:rStyle w:val="m"/>
+        </w:rPr>
+        <w:t>Navbar</w:t>
+      </w:r>
+      <w:r>
+        <w:rPr>
+          <w:rStyle w:val="HTMLCode"/>
+          <w:rFonts w:ascii="Times New Roman" w:eastAsiaTheme="minorHAnsi" w:hAnsi="Times New Roman" w:cstheme="minorBidi"/>
+          <w:sz w:val="24"/>
+          <w:szCs w:val="22"/>
+        </w:rPr>
+        <w:t xml:space="preserve"> </w:t>
+      </w:r>
+      <w:r>
+        <w:rPr>
+          <w:rStyle w:val="g"/>
+        </w:rPr>
+        <w:t>=</w:t>
+      </w:r>
+      <w:r>
+        <w:rPr>
+          <w:rStyle w:val="HTMLCode"/>
+          <w:rFonts w:ascii="Times New Roman" w:eastAsiaTheme="minorHAnsi" w:hAnsi="Times New Roman" w:cstheme="minorBidi"/>
+          <w:sz w:val="24"/>
+          <w:szCs w:val="22"/>
+        </w:rPr>
+        <w:t xml:space="preserve"> () =&gt; {</w:t>
+      </w:r>
+    </w:p>
+    <w:p>
+      <w:pPr>
+        <w:pStyle w:val="NoSpacing"/>
+        <w:rPr>
+          <w:rStyle w:val="HTMLCode"/>
+          <w:rFonts w:ascii="Times New Roman" w:eastAsiaTheme="minorHAnsi" w:hAnsi="Times New Roman" w:cstheme="minorBidi"/>
+          <w:sz w:val="24"/>
+          <w:szCs w:val="22"/>
+        </w:rPr>
+      </w:pPr>
+    </w:p>
+    <w:p>
+      <w:pPr>
+        <w:pStyle w:val="NoSpacing"/>
+        <w:rPr>
+          <w:rStyle w:val="HTMLCode"/>
+          <w:rFonts w:ascii="Times New Roman" w:eastAsiaTheme="minorHAnsi" w:hAnsi="Times New Roman" w:cstheme="minorBidi"/>
+          <w:sz w:val="24"/>
+          <w:szCs w:val="22"/>
+        </w:rPr>
+      </w:pPr>
+      <w:r>
+        <w:rPr>
+          <w:rStyle w:val="HTMLCode"/>
+          <w:rFonts w:ascii="Times New Roman" w:eastAsiaTheme="minorHAnsi" w:hAnsi="Times New Roman" w:cstheme="minorBidi"/>
+          <w:sz w:val="24"/>
+          <w:szCs w:val="22"/>
+        </w:rPr>
+        <w:t xml:space="preserve">  </w:t>
+      </w:r>
+      <w:r>
+        <w:rPr>
+          <w:rStyle w:val="g"/>
+        </w:rPr>
+        <w:t>const</w:t>
+      </w:r>
+      <w:r>
+        <w:rPr>
+          <w:rStyle w:val="HTMLCode"/>
+          <w:rFonts w:ascii="Times New Roman" w:eastAsiaTheme="minorHAnsi" w:hAnsi="Times New Roman" w:cstheme="minorBidi"/>
+          <w:sz w:val="24"/>
+          <w:szCs w:val="22"/>
+        </w:rPr>
+        <w:t xml:space="preserve"> </w:t>
+      </w:r>
+      <w:proofErr w:type="gramStart"/>
+      <w:r>
+        <w:rPr>
+          <w:rStyle w:val="HTMLCode"/>
+          <w:rFonts w:ascii="Times New Roman" w:eastAsiaTheme="minorHAnsi" w:hAnsi="Times New Roman" w:cstheme="minorBidi"/>
+          <w:sz w:val="24"/>
+          <w:szCs w:val="22"/>
+        </w:rPr>
+        <w:t>{ logout</w:t>
+      </w:r>
+      <w:proofErr w:type="gramEnd"/>
+      <w:r>
+        <w:rPr>
+          <w:rStyle w:val="HTMLCode"/>
+          <w:rFonts w:ascii="Times New Roman" w:eastAsiaTheme="minorHAnsi" w:hAnsi="Times New Roman" w:cstheme="minorBidi"/>
+          <w:sz w:val="24"/>
+          <w:szCs w:val="22"/>
+        </w:rPr>
+        <w:t xml:space="preserve"> } </w:t>
+      </w:r>
+      <w:r>
+        <w:rPr>
+          <w:rStyle w:val="g"/>
+        </w:rPr>
+        <w:t>=</w:t>
+      </w:r>
+      <w:r>
+        <w:rPr>
+          <w:rStyle w:val="HTMLCode"/>
+          <w:rFonts w:ascii="Times New Roman" w:eastAsiaTheme="minorHAnsi" w:hAnsi="Times New Roman" w:cstheme="minorBidi"/>
+          <w:sz w:val="24"/>
+          <w:szCs w:val="22"/>
+        </w:rPr>
+        <w:t xml:space="preserve"> </w:t>
+      </w:r>
+      <w:proofErr w:type="spellStart"/>
+      <w:r>
+        <w:rPr>
+          <w:rStyle w:val="m"/>
+        </w:rPr>
+        <w:t>useAuth</w:t>
+      </w:r>
+      <w:proofErr w:type="spellEnd"/>
+      <w:r>
+        <w:rPr>
+          <w:rStyle w:val="HTMLCode"/>
+          <w:rFonts w:ascii="Times New Roman" w:eastAsiaTheme="minorHAnsi" w:hAnsi="Times New Roman" w:cstheme="minorBidi"/>
+          <w:sz w:val="24"/>
+          <w:szCs w:val="22"/>
+        </w:rPr>
+        <w:t>();</w:t>
+      </w:r>
+    </w:p>
+    <w:p>
+      <w:pPr>
+        <w:pStyle w:val="NoSpacing"/>
+        <w:rPr>
+          <w:rStyle w:val="HTMLCode"/>
+          <w:rFonts w:ascii="Times New Roman" w:eastAsiaTheme="minorHAnsi" w:hAnsi="Times New Roman" w:cstheme="minorBidi"/>
+          <w:sz w:val="24"/>
+          <w:szCs w:val="22"/>
+        </w:rPr>
+      </w:pPr>
+    </w:p>
+    <w:p>
+      <w:pPr>
+        <w:pStyle w:val="NoSpacing"/>
+        <w:rPr>
+          <w:rStyle w:val="HTMLCode"/>
+          <w:rFonts w:ascii="Times New Roman" w:eastAsiaTheme="minorHAnsi" w:hAnsi="Times New Roman" w:cstheme="minorBidi"/>
+          <w:sz w:val="24"/>
+          <w:szCs w:val="22"/>
+        </w:rPr>
+      </w:pPr>
+      <w:r>
+        <w:rPr>
+          <w:rStyle w:val="HTMLCode"/>
+          <w:rFonts w:ascii="Times New Roman" w:eastAsiaTheme="minorHAnsi" w:hAnsi="Times New Roman" w:cstheme="minorBidi"/>
+          <w:sz w:val="24"/>
+          <w:szCs w:val="22"/>
+        </w:rPr>
+        <w:t xml:space="preserve">  </w:t>
+      </w:r>
+      <w:r>
+        <w:rPr>
+          <w:rStyle w:val="g"/>
+        </w:rPr>
+        <w:t>return</w:t>
+      </w:r>
+      <w:r>
+        <w:rPr>
+          <w:rStyle w:val="HTMLCode"/>
+          <w:rFonts w:ascii="Times New Roman" w:eastAsiaTheme="minorHAnsi" w:hAnsi="Times New Roman" w:cstheme="minorBidi"/>
+          <w:sz w:val="24"/>
+          <w:szCs w:val="22"/>
+        </w:rPr>
+        <w:t xml:space="preserve"> (</w:t>
+      </w:r>
+    </w:p>
+    <w:p>
+      <w:pPr>
+        <w:pStyle w:val="NoSpacing"/>
+        <w:rPr>
+          <w:rStyle w:val="HTMLCode"/>
+          <w:rFonts w:ascii="Times New Roman" w:eastAsiaTheme="minorHAnsi" w:hAnsi="Times New Roman" w:cstheme="minorBidi"/>
+          <w:sz w:val="24"/>
+          <w:szCs w:val="22"/>
+        </w:rPr>
+      </w:pPr>
+      <w:r>
+        <w:rPr>
+          <w:rStyle w:val="HTMLCode"/>
+          <w:rFonts w:ascii="Times New Roman" w:eastAsiaTheme="minorHAnsi" w:hAnsi="Times New Roman" w:cstheme="minorBidi"/>
+          <w:sz w:val="24"/>
+          <w:szCs w:val="22"/>
+        </w:rPr>
+        <w:t xml:space="preserve">    </w:t>
+      </w:r>
+      <w:r>
+        <w:rPr>
+          <w:rStyle w:val="o"/>
+        </w:rPr>
+        <w:t>&lt;div&gt;</w:t>
+      </w:r>
+    </w:p>
+    <w:p>
+      <w:pPr>
+        <w:pStyle w:val="NoSpacing"/>
+        <w:rPr>
+          <w:rStyle w:val="HTMLCode"/>
+          <w:rFonts w:ascii="Times New Roman" w:eastAsiaTheme="minorHAnsi" w:hAnsi="Times New Roman" w:cstheme="minorBidi"/>
+          <w:sz w:val="24"/>
+          <w:szCs w:val="22"/>
+        </w:rPr>
+      </w:pPr>
+      <w:r>
+        <w:rPr>
+          <w:rStyle w:val="HTMLCode"/>
+          <w:rFonts w:ascii="Times New Roman" w:eastAsiaTheme="minorHAnsi" w:hAnsi="Times New Roman" w:cstheme="minorBidi"/>
+          <w:sz w:val="24"/>
+          <w:szCs w:val="22"/>
+        </w:rPr>
+        <w:t xml:space="preserve">      </w:t>
+      </w:r>
+      <w:r>
+        <w:rPr>
+          <w:rStyle w:val="o"/>
+        </w:rPr>
+        <w:t>&lt;button</w:t>
+      </w:r>
+      <w:r>
+        <w:rPr>
+          <w:rStyle w:val="HTMLCode"/>
+          <w:rFonts w:ascii="Times New Roman" w:eastAsiaTheme="minorHAnsi" w:hAnsi="Times New Roman" w:cstheme="minorBidi"/>
+          <w:sz w:val="24"/>
+          <w:szCs w:val="22"/>
+        </w:rPr>
+        <w:t xml:space="preserve"> </w:t>
+      </w:r>
+      <w:proofErr w:type="spellStart"/>
+      <w:r>
+        <w:rPr>
+          <w:rStyle w:val="n"/>
+        </w:rPr>
+        <w:t>onClick</w:t>
+      </w:r>
+      <w:proofErr w:type="spellEnd"/>
+      <w:r>
+        <w:rPr>
+          <w:rStyle w:val="g"/>
+        </w:rPr>
+        <w:t>=</w:t>
+      </w:r>
+      <w:r>
+        <w:rPr>
+          <w:rStyle w:val="HTMLCode"/>
+          <w:rFonts w:ascii="Times New Roman" w:eastAsiaTheme="minorHAnsi" w:hAnsi="Times New Roman" w:cstheme="minorBidi"/>
+          <w:sz w:val="24"/>
+          <w:szCs w:val="22"/>
+        </w:rPr>
+        <w:t>{</w:t>
+      </w:r>
+      <w:r>
+        <w:rPr>
+          <w:rStyle w:val="m"/>
+        </w:rPr>
+        <w:t>logout</w:t>
+      </w:r>
+      <w:r>
+        <w:rPr>
+          <w:rStyle w:val="HTMLCode"/>
+          <w:rFonts w:ascii="Times New Roman" w:eastAsiaTheme="minorHAnsi" w:hAnsi="Times New Roman" w:cstheme="minorBidi"/>
+          <w:sz w:val="24"/>
+          <w:szCs w:val="22"/>
+        </w:rPr>
+        <w:t>}</w:t>
+      </w:r>
+      <w:r>
+        <w:rPr>
+          <w:rStyle w:val="o"/>
+        </w:rPr>
+        <w:t>&gt;</w:t>
+      </w:r>
+    </w:p>
+    <w:p>
+      <w:pPr>
+        <w:pStyle w:val="NoSpacing"/>
+        <w:rPr>
+          <w:rStyle w:val="HTMLCode"/>
+          <w:rFonts w:ascii="Times New Roman" w:eastAsiaTheme="minorHAnsi" w:hAnsi="Times New Roman" w:cstheme="minorBidi"/>
+          <w:sz w:val="24"/>
+          <w:szCs w:val="22"/>
+        </w:rPr>
+      </w:pPr>
+      <w:r>
+        <w:rPr>
+          <w:rStyle w:val="HTMLCode"/>
+          <w:rFonts w:ascii="Times New Roman" w:eastAsiaTheme="minorHAnsi" w:hAnsi="Times New Roman" w:cstheme="minorBidi"/>
+          <w:sz w:val="24"/>
+          <w:szCs w:val="22"/>
+        </w:rPr>
+        <w:t xml:space="preserve">        Logout</w:t>
+      </w:r>
+    </w:p>
+    <w:p>
+      <w:pPr>
+        <w:pStyle w:val="NoSpacing"/>
+        <w:rPr>
+          <w:rStyle w:val="HTMLCode"/>
+          <w:rFonts w:ascii="Times New Roman" w:eastAsiaTheme="minorHAnsi" w:hAnsi="Times New Roman" w:cstheme="minorBidi"/>
+          <w:sz w:val="24"/>
+          <w:szCs w:val="22"/>
+        </w:rPr>
+      </w:pPr>
+      <w:r>
+        <w:rPr>
+          <w:rStyle w:val="HTMLCode"/>
+          <w:rFonts w:ascii="Times New Roman" w:eastAsiaTheme="minorHAnsi" w:hAnsi="Times New Roman" w:cstheme="minorBidi"/>
+          <w:sz w:val="24"/>
+          <w:szCs w:val="22"/>
+        </w:rPr>
+        <w:t xml:space="preserve">      </w:t>
+      </w:r>
+      <w:r>
+        <w:rPr>
+          <w:rStyle w:val="o"/>
+        </w:rPr>
+        <w:t>&lt;/button&gt;</w:t>
+      </w:r>
+    </w:p>
+    <w:p>
+      <w:pPr>
+        <w:pStyle w:val="NoSpacing"/>
+        <w:rPr>
+          <w:rStyle w:val="HTMLCode"/>
+          <w:rFonts w:ascii="Times New Roman" w:eastAsiaTheme="minorHAnsi" w:hAnsi="Times New Roman" w:cstheme="minorBidi"/>
+          <w:sz w:val="24"/>
+          <w:szCs w:val="22"/>
+        </w:rPr>
+      </w:pPr>
+      <w:r>
+        <w:rPr>
+          <w:rStyle w:val="HTMLCode"/>
+          <w:rFonts w:ascii="Times New Roman" w:eastAsiaTheme="minorHAnsi" w:hAnsi="Times New Roman" w:cstheme="minorBidi"/>
+          <w:sz w:val="24"/>
+          <w:szCs w:val="22"/>
+        </w:rPr>
+        <w:t xml:space="preserve">    </w:t>
+      </w:r>
+      <w:r>
+        <w:rPr>
+          <w:rStyle w:val="o"/>
+        </w:rPr>
+        <w:t>&lt;/div&gt;</w:t>
+      </w:r>
+    </w:p>
+    <w:p>
+      <w:pPr>
+        <w:pStyle w:val="NoSpacing"/>
+        <w:rPr>
+          <w:rStyle w:val="HTMLCode"/>
+          <w:rFonts w:ascii="Times New Roman" w:eastAsiaTheme="minorHAnsi" w:hAnsi="Times New Roman" w:cstheme="minorBidi"/>
+          <w:sz w:val="24"/>
+          <w:szCs w:val="22"/>
+        </w:rPr>
+      </w:pPr>
+      <w:r>
+        <w:rPr>
+          <w:rStyle w:val="HTMLCode"/>
+          <w:rFonts w:ascii="Times New Roman" w:eastAsiaTheme="minorHAnsi" w:hAnsi="Times New Roman" w:cstheme="minorBidi"/>
+          <w:sz w:val="24"/>
+          <w:szCs w:val="22"/>
+        </w:rPr>
+        <w:t xml:space="preserve">  );</w:t>
+      </w:r>
+    </w:p>
+    <w:p>
+      <w:pPr>
+        <w:pStyle w:val="NoSpacing"/>
+        <w:rPr>
+          <w:rStyle w:val="HTMLCode"/>
+          <w:rFonts w:ascii="Times New Roman" w:eastAsiaTheme="minorHAnsi" w:hAnsi="Times New Roman" w:cstheme="minorBidi"/>
+          <w:sz w:val="24"/>
+          <w:szCs w:val="22"/>
+        </w:rPr>
+      </w:pPr>
+      <w:r>
+        <w:rPr>
+          <w:rStyle w:val="HTMLCode"/>
+          <w:rFonts w:ascii="Times New Roman" w:eastAsiaTheme="minorHAnsi" w:hAnsi="Times New Roman" w:cstheme="minorBidi"/>
+          <w:sz w:val="24"/>
+          <w:szCs w:val="22"/>
+        </w:rPr>
+        <w:t>};</w:t>
+      </w:r>
+    </w:p>
+    <w:p>
+      <w:pPr>
+        <w:pStyle w:val="NoSpacing"/>
+        <w:rPr>
+          <w:rStyle w:val="HTMLCode"/>
+          <w:rFonts w:eastAsiaTheme="minorHAnsi"/>
+        </w:rPr>
+      </w:pPr>
+    </w:p>
+    <w:p>
+      <w:pPr>
+        <w:pStyle w:val="NoSpacing"/>
+      </w:pPr>
+      <w:r>
+        <w:rPr>
+          <w:rStyle w:val="g"/>
+        </w:rPr>
+        <w:t>export</w:t>
+      </w:r>
+      <w:r>
+        <w:rPr>
+          <w:rStyle w:val="HTMLCode"/>
+          <w:rFonts w:eastAsiaTheme="minorHAnsi"/>
+        </w:rPr>
+        <w:t xml:space="preserve"> </w:t>
+      </w:r>
+      <w:r>
+        <w:rPr>
+          <w:rStyle w:val="g"/>
+        </w:rPr>
+        <w:t>default</w:t>
+      </w:r>
+      <w:r>
+        <w:rPr>
+          <w:rStyle w:val="HTMLCode"/>
+          <w:rFonts w:eastAsiaTheme="minorHAnsi"/>
+        </w:rPr>
+        <w:t xml:space="preserve"> </w:t>
+      </w:r>
+      <w:r>
+        <w:rPr>
+          <w:rStyle w:val="m"/>
+        </w:rPr>
+        <w:t>Navbar</w:t>
+      </w:r>
+      <w:r>
+        <w:rPr>
+          <w:rStyle w:val="HTMLCode"/>
+          <w:rFonts w:eastAsiaTheme="minorHAnsi"/>
+        </w:rPr>
+        <w:t>;</w:t>
+      </w:r>
+    </w:p>
+    <w:p>
+      <w:pPr>
+        <w:pStyle w:val="NoSpacing"/>
+      </w:pPr>
+    </w:p>
+    <w:p>
+      <w:pPr>
+        <w:pStyle w:val="NoSpacing"/>
+        <w:rPr>
+          <w:b/>
+        </w:rPr>
+      </w:pPr>
+    </w:p>
+    <w:p>
+      <w:pPr>
+        <w:pStyle w:val="NoSpacing"/>
+        <w:rPr>
+          <w:b/>
+        </w:rPr>
+      </w:pPr>
+    </w:p>
+    <w:p>
+      <w:pPr>
+        <w:pStyle w:val="NoSpacing"/>
+        <w:rPr>
+          <w:b/>
+        </w:rPr>
+      </w:pPr>
+    </w:p>
+    <w:p>
+      <w:pPr>
+        <w:pStyle w:val="NoSpacing"/>
+        <w:rPr>
+          <w:b/>
+        </w:rPr>
+      </w:pPr>
+    </w:p>
+    <w:p>
+      <w:pPr>
+        <w:pStyle w:val="NoSpacing"/>
+        <w:rPr>
+          <w:b/>
+        </w:rPr>
+      </w:pPr>
+    </w:p>
+    <w:p>
+      <w:pPr>
+        <w:pStyle w:val="NoSpacing"/>
+        <w:rPr>
+          <w:b/>
+        </w:rPr>
+      </w:pPr>
+    </w:p>
+    <w:p>
+      <w:pPr>
+        <w:pStyle w:val="NoSpacing"/>
+        <w:rPr>
+          <w:b/>
+        </w:rPr>
+      </w:pPr>
+    </w:p>
+    <w:p>
+      <w:pPr>
+        <w:pStyle w:val="NoSpacing"/>
+        <w:rPr>
+          <w:b/>
+        </w:rPr>
+      </w:pPr>
+    </w:p>
+    <w:p>
+      <w:pPr>
+        <w:pStyle w:val="NoSpacing"/>
+        <w:rPr>
+          <w:b/>
+        </w:rPr>
+      </w:pPr>
+    </w:p>
+    <w:p>
+      <w:pPr>
+        <w:pStyle w:val="NoSpacing"/>
+        <w:rPr>
+          <w:b/>
+        </w:rPr>
+      </w:pPr>
+    </w:p>
+    <w:p>
+      <w:pPr>
+        <w:pStyle w:val="NoSpacing"/>
+        <w:rPr>
+          <w:b/>
+        </w:rPr>
+      </w:pPr>
+    </w:p>
+    <w:p>
+      <w:pPr>
+        <w:pStyle w:val="NoSpacing"/>
+        <w:rPr>
+          <w:b/>
+        </w:rPr>
+      </w:pPr>
+    </w:p>
+    <w:p>
+      <w:pPr>
+        <w:pStyle w:val="NoSpacing"/>
+        <w:rPr>
+          <w:b/>
+        </w:rPr>
+      </w:pPr>
+    </w:p>
+    <w:p>
+      <w:pPr>
+        <w:pStyle w:val="NoSpacing"/>
+        <w:rPr>
+          <w:b/>
+        </w:rPr>
+      </w:pPr>
+    </w:p>
+    <w:p>
+      <w:pPr>
+        <w:pStyle w:val="NoSpacing"/>
+        <w:rPr>
+          <w:b/>
+        </w:rPr>
+      </w:pPr>
+      <w:r>
+        <w:rPr>
+          <w:b/>
+        </w:rPr>
+        <w:lastRenderedPageBreak/>
+        <w:t xml:space="preserve">Step </w:t>
+      </w:r>
+      <w:proofErr w:type="gramStart"/>
+      <w:r>
+        <w:rPr>
+          <w:b/>
+        </w:rPr>
+        <w:t>6 :</w:t>
+      </w:r>
+      <w:proofErr w:type="gramEnd"/>
+      <w:r>
+        <w:rPr>
+          <w:b/>
+        </w:rPr>
+        <w:t xml:space="preserve"> </w:t>
+      </w:r>
+      <w:proofErr w:type="spellStart"/>
+      <w:r>
+        <w:rPr>
+          <w:b/>
+        </w:rPr>
+        <w:t>App.jsx</w:t>
+      </w:r>
+      <w:proofErr w:type="spellEnd"/>
+    </w:p>
+    <w:p>
+      <w:pPr>
+        <w:pStyle w:val="NoSpacing"/>
+        <w:rPr>
+          <w:rStyle w:val="HTMLCode"/>
+          <w:rFonts w:ascii="Times New Roman" w:eastAsiaTheme="minorHAnsi" w:hAnsi="Times New Roman" w:cstheme="minorBidi"/>
+          <w:sz w:val="24"/>
+          <w:szCs w:val="22"/>
+        </w:rPr>
+      </w:pPr>
+      <w:r>
+        <w:rPr>
+          <w:rStyle w:val="g"/>
+        </w:rPr>
+        <w:t>import</w:t>
+      </w:r>
+      <w:r>
+        <w:rPr>
+          <w:rStyle w:val="HTMLCode"/>
+          <w:rFonts w:ascii="Times New Roman" w:eastAsiaTheme="minorHAnsi" w:hAnsi="Times New Roman" w:cstheme="minorBidi"/>
+          <w:sz w:val="24"/>
+          <w:szCs w:val="22"/>
+        </w:rPr>
+        <w:t xml:space="preserve"> </w:t>
+      </w:r>
+      <w:r>
+        <w:rPr>
+          <w:rStyle w:val="m"/>
+        </w:rPr>
+        <w:t>Login</w:t>
+      </w:r>
+      <w:r>
+        <w:rPr>
+          <w:rStyle w:val="HTMLCode"/>
+          <w:rFonts w:ascii="Times New Roman" w:eastAsiaTheme="minorHAnsi" w:hAnsi="Times New Roman" w:cstheme="minorBidi"/>
+          <w:sz w:val="24"/>
+          <w:szCs w:val="22"/>
+        </w:rPr>
+        <w:t xml:space="preserve"> </w:t>
+      </w:r>
+      <w:r>
+        <w:rPr>
+          <w:rStyle w:val="g"/>
+        </w:rPr>
+        <w:t>from</w:t>
+      </w:r>
+      <w:r>
+        <w:rPr>
+          <w:rStyle w:val="HTMLCode"/>
+          <w:rFonts w:ascii="Times New Roman" w:eastAsiaTheme="minorHAnsi" w:hAnsi="Times New Roman" w:cstheme="minorBidi"/>
+          <w:sz w:val="24"/>
+          <w:szCs w:val="22"/>
+        </w:rPr>
+        <w:t xml:space="preserve"> </w:t>
+      </w:r>
+      <w:proofErr w:type="gramStart"/>
+      <w:r>
+        <w:rPr>
+          <w:rStyle w:val="k"/>
+        </w:rPr>
+        <w:t>"./</w:t>
+      </w:r>
+      <w:proofErr w:type="gramEnd"/>
+      <w:r>
+        <w:rPr>
+          <w:rStyle w:val="k"/>
+        </w:rPr>
+        <w:t>components/Login"</w:t>
+      </w:r>
+      <w:r>
+        <w:rPr>
+          <w:rStyle w:val="HTMLCode"/>
+          <w:rFonts w:ascii="Times New Roman" w:eastAsiaTheme="minorHAnsi" w:hAnsi="Times New Roman" w:cstheme="minorBidi"/>
+          <w:sz w:val="24"/>
+          <w:szCs w:val="22"/>
+        </w:rPr>
+        <w:t>;</w:t>
+      </w:r>
+    </w:p>
+    <w:p>
+      <w:pPr>
+        <w:pStyle w:val="NoSpacing"/>
+        <w:rPr>
+          <w:rStyle w:val="HTMLCode"/>
+          <w:rFonts w:ascii="Times New Roman" w:eastAsiaTheme="minorHAnsi" w:hAnsi="Times New Roman" w:cstheme="minorBidi"/>
+          <w:sz w:val="24"/>
+          <w:szCs w:val="22"/>
+        </w:rPr>
+      </w:pPr>
+      <w:r>
+        <w:rPr>
+          <w:rStyle w:val="g"/>
+        </w:rPr>
+        <w:t>import</w:t>
+      </w:r>
+      <w:r>
+        <w:rPr>
+          <w:rStyle w:val="HTMLCode"/>
+          <w:rFonts w:ascii="Times New Roman" w:eastAsiaTheme="minorHAnsi" w:hAnsi="Times New Roman" w:cstheme="minorBidi"/>
+          <w:sz w:val="24"/>
+          <w:szCs w:val="22"/>
+        </w:rPr>
+        <w:t xml:space="preserve"> </w:t>
+      </w:r>
+      <w:r>
+        <w:rPr>
+          <w:rStyle w:val="m"/>
+        </w:rPr>
+        <w:t>Dashboard</w:t>
+      </w:r>
+      <w:r>
+        <w:rPr>
+          <w:rStyle w:val="HTMLCode"/>
+          <w:rFonts w:ascii="Times New Roman" w:eastAsiaTheme="minorHAnsi" w:hAnsi="Times New Roman" w:cstheme="minorBidi"/>
+          <w:sz w:val="24"/>
+          <w:szCs w:val="22"/>
+        </w:rPr>
+        <w:t xml:space="preserve"> </w:t>
+      </w:r>
+      <w:r>
+        <w:rPr>
+          <w:rStyle w:val="g"/>
+        </w:rPr>
+        <w:t>from</w:t>
+      </w:r>
+      <w:r>
+        <w:rPr>
+          <w:rStyle w:val="HTMLCode"/>
+          <w:rFonts w:ascii="Times New Roman" w:eastAsiaTheme="minorHAnsi" w:hAnsi="Times New Roman" w:cstheme="minorBidi"/>
+          <w:sz w:val="24"/>
+          <w:szCs w:val="22"/>
+        </w:rPr>
+        <w:t xml:space="preserve"> </w:t>
+      </w:r>
+      <w:proofErr w:type="gramStart"/>
+      <w:r>
+        <w:rPr>
+          <w:rStyle w:val="k"/>
+        </w:rPr>
+        <w:t>"./</w:t>
+      </w:r>
+      <w:proofErr w:type="gramEnd"/>
+      <w:r>
+        <w:rPr>
+          <w:rStyle w:val="k"/>
+        </w:rPr>
+        <w:t>components/Dashboard"</w:t>
+      </w:r>
+      <w:r>
+        <w:rPr>
+          <w:rStyle w:val="HTMLCode"/>
+          <w:rFonts w:ascii="Times New Roman" w:eastAsiaTheme="minorHAnsi" w:hAnsi="Times New Roman" w:cstheme="minorBidi"/>
+          <w:sz w:val="24"/>
+          <w:szCs w:val="22"/>
+        </w:rPr>
+        <w:t>;</w:t>
+      </w:r>
+    </w:p>
+    <w:p>
+      <w:pPr>
+        <w:pStyle w:val="NoSpacing"/>
+        <w:rPr>
+          <w:rStyle w:val="HTMLCode"/>
+          <w:rFonts w:ascii="Times New Roman" w:eastAsiaTheme="minorHAnsi" w:hAnsi="Times New Roman" w:cstheme="minorBidi"/>
+          <w:sz w:val="24"/>
+          <w:szCs w:val="22"/>
+        </w:rPr>
+      </w:pPr>
+      <w:r>
+        <w:rPr>
+          <w:rStyle w:val="g"/>
+        </w:rPr>
+        <w:t>import</w:t>
+      </w:r>
+      <w:r>
+        <w:rPr>
+          <w:rStyle w:val="HTMLCode"/>
+          <w:rFonts w:ascii="Times New Roman" w:eastAsiaTheme="minorHAnsi" w:hAnsi="Times New Roman" w:cstheme="minorBidi"/>
+          <w:sz w:val="24"/>
+          <w:szCs w:val="22"/>
+        </w:rPr>
+        <w:t xml:space="preserve"> </w:t>
+      </w:r>
+      <w:r>
+        <w:rPr>
+          <w:rStyle w:val="m"/>
+        </w:rPr>
+        <w:t>Navbar</w:t>
+      </w:r>
+      <w:r>
+        <w:rPr>
+          <w:rStyle w:val="HTMLCode"/>
+          <w:rFonts w:ascii="Times New Roman" w:eastAsiaTheme="minorHAnsi" w:hAnsi="Times New Roman" w:cstheme="minorBidi"/>
+          <w:sz w:val="24"/>
+          <w:szCs w:val="22"/>
+        </w:rPr>
+        <w:t xml:space="preserve"> </w:t>
+      </w:r>
+      <w:r>
+        <w:rPr>
+          <w:rStyle w:val="g"/>
+        </w:rPr>
+        <w:t>from</w:t>
+      </w:r>
+      <w:r>
+        <w:rPr>
+          <w:rStyle w:val="HTMLCode"/>
+          <w:rFonts w:ascii="Times New Roman" w:eastAsiaTheme="minorHAnsi" w:hAnsi="Times New Roman" w:cstheme="minorBidi"/>
+          <w:sz w:val="24"/>
+          <w:szCs w:val="22"/>
+        </w:rPr>
+        <w:t xml:space="preserve"> </w:t>
+      </w:r>
+      <w:proofErr w:type="gramStart"/>
+      <w:r>
+        <w:rPr>
+          <w:rStyle w:val="k"/>
+        </w:rPr>
+        <w:t>"./</w:t>
+      </w:r>
+      <w:proofErr w:type="gramEnd"/>
+      <w:r>
+        <w:rPr>
+          <w:rStyle w:val="k"/>
+        </w:rPr>
+        <w:t>components/Navbar"</w:t>
+      </w:r>
+      <w:r>
+        <w:rPr>
+          <w:rStyle w:val="HTMLCode"/>
+          <w:rFonts w:ascii="Times New Roman" w:eastAsiaTheme="minorHAnsi" w:hAnsi="Times New Roman" w:cstheme="minorBidi"/>
+          <w:sz w:val="24"/>
+          <w:szCs w:val="22"/>
+        </w:rPr>
+        <w:t>;</w:t>
+      </w:r>
+    </w:p>
+    <w:p>
+      <w:pPr>
+        <w:pStyle w:val="NoSpacing"/>
+        <w:rPr>
+          <w:rStyle w:val="HTMLCode"/>
+          <w:rFonts w:ascii="Times New Roman" w:eastAsiaTheme="minorHAnsi" w:hAnsi="Times New Roman" w:cstheme="minorBidi"/>
+          <w:sz w:val="24"/>
+          <w:szCs w:val="22"/>
+        </w:rPr>
+      </w:pPr>
+      <w:r>
+        <w:rPr>
+          <w:rStyle w:val="g"/>
+        </w:rPr>
+        <w:t>import</w:t>
+      </w:r>
+      <w:r>
+        <w:rPr>
+          <w:rStyle w:val="HTMLCode"/>
+          <w:rFonts w:ascii="Times New Roman" w:eastAsiaTheme="minorHAnsi" w:hAnsi="Times New Roman" w:cstheme="minorBidi"/>
+          <w:sz w:val="24"/>
+          <w:szCs w:val="22"/>
+        </w:rPr>
+        <w:t xml:space="preserve"> </w:t>
+      </w:r>
+      <w:proofErr w:type="gramStart"/>
+      <w:r>
+        <w:rPr>
+          <w:rStyle w:val="HTMLCode"/>
+          <w:rFonts w:ascii="Times New Roman" w:eastAsiaTheme="minorHAnsi" w:hAnsi="Times New Roman" w:cstheme="minorBidi"/>
+          <w:sz w:val="24"/>
+          <w:szCs w:val="22"/>
+        </w:rPr>
+        <w:t xml:space="preserve">{ </w:t>
+      </w:r>
+      <w:proofErr w:type="spellStart"/>
+      <w:r>
+        <w:rPr>
+          <w:rStyle w:val="m"/>
+        </w:rPr>
+        <w:t>useAuth</w:t>
+      </w:r>
+      <w:proofErr w:type="spellEnd"/>
+      <w:proofErr w:type="gramEnd"/>
+      <w:r>
+        <w:rPr>
+          <w:rStyle w:val="HTMLCode"/>
+          <w:rFonts w:ascii="Times New Roman" w:eastAsiaTheme="minorHAnsi" w:hAnsi="Times New Roman" w:cstheme="minorBidi"/>
+          <w:sz w:val="24"/>
+          <w:szCs w:val="22"/>
+        </w:rPr>
+        <w:t xml:space="preserve"> } </w:t>
+      </w:r>
+      <w:r>
+        <w:rPr>
+          <w:rStyle w:val="g"/>
+        </w:rPr>
+        <w:t>from</w:t>
+      </w:r>
+      <w:r>
+        <w:rPr>
+          <w:rStyle w:val="HTMLCode"/>
+          <w:rFonts w:ascii="Times New Roman" w:eastAsiaTheme="minorHAnsi" w:hAnsi="Times New Roman" w:cstheme="minorBidi"/>
+          <w:sz w:val="24"/>
+          <w:szCs w:val="22"/>
+        </w:rPr>
+        <w:t xml:space="preserve"> </w:t>
+      </w:r>
+      <w:r>
+        <w:rPr>
+          <w:rStyle w:val="k"/>
+        </w:rPr>
+        <w:t>"./context/</w:t>
+      </w:r>
+      <w:proofErr w:type="spellStart"/>
+      <w:r>
+        <w:rPr>
+          <w:rStyle w:val="k"/>
+        </w:rPr>
+        <w:t>AuthContext</w:t>
+      </w:r>
+      <w:proofErr w:type="spellEnd"/>
+      <w:r>
+        <w:rPr>
+          <w:rStyle w:val="k"/>
+        </w:rPr>
+        <w:t>"</w:t>
+      </w:r>
+      <w:r>
+        <w:rPr>
+          <w:rStyle w:val="HTMLCode"/>
+          <w:rFonts w:ascii="Times New Roman" w:eastAsiaTheme="minorHAnsi" w:hAnsi="Times New Roman" w:cstheme="minorBidi"/>
+          <w:sz w:val="24"/>
+          <w:szCs w:val="22"/>
+        </w:rPr>
+        <w:t>;</w:t>
+      </w:r>
+    </w:p>
+    <w:p>
+      <w:pPr>
+        <w:pStyle w:val="NoSpacing"/>
+        <w:rPr>
+          <w:rStyle w:val="HTMLCode"/>
+          <w:rFonts w:ascii="Times New Roman" w:eastAsiaTheme="minorHAnsi" w:hAnsi="Times New Roman" w:cstheme="minorBidi"/>
+          <w:sz w:val="24"/>
+          <w:szCs w:val="22"/>
+        </w:rPr>
+      </w:pPr>
+    </w:p>
+    <w:p>
+      <w:pPr>
+        <w:pStyle w:val="NoSpacing"/>
+        <w:rPr>
+          <w:rStyle w:val="HTMLCode"/>
+          <w:rFonts w:ascii="Times New Roman" w:eastAsiaTheme="minorHAnsi" w:hAnsi="Times New Roman" w:cstheme="minorBidi"/>
+          <w:sz w:val="24"/>
+          <w:szCs w:val="22"/>
+        </w:rPr>
+      </w:pPr>
+      <w:r>
+        <w:rPr>
+          <w:rStyle w:val="g"/>
+        </w:rPr>
+        <w:t>function</w:t>
+      </w:r>
+      <w:r>
+        <w:rPr>
+          <w:rStyle w:val="HTMLCode"/>
+          <w:rFonts w:ascii="Times New Roman" w:eastAsiaTheme="minorHAnsi" w:hAnsi="Times New Roman" w:cstheme="minorBidi"/>
+          <w:sz w:val="24"/>
+          <w:szCs w:val="22"/>
+        </w:rPr>
+        <w:t xml:space="preserve"> </w:t>
+      </w:r>
+      <w:proofErr w:type="gramStart"/>
+      <w:r>
+        <w:rPr>
+          <w:rStyle w:val="m"/>
+        </w:rPr>
+        <w:t>App</w:t>
+      </w:r>
+      <w:r>
+        <w:rPr>
+          <w:rStyle w:val="HTMLCode"/>
+          <w:rFonts w:ascii="Times New Roman" w:eastAsiaTheme="minorHAnsi" w:hAnsi="Times New Roman" w:cstheme="minorBidi"/>
+          <w:sz w:val="24"/>
+          <w:szCs w:val="22"/>
+        </w:rPr>
+        <w:t>(</w:t>
+      </w:r>
+      <w:proofErr w:type="gramEnd"/>
+      <w:r>
+        <w:rPr>
+          <w:rStyle w:val="HTMLCode"/>
+          <w:rFonts w:ascii="Times New Roman" w:eastAsiaTheme="minorHAnsi" w:hAnsi="Times New Roman" w:cstheme="minorBidi"/>
+          <w:sz w:val="24"/>
+          <w:szCs w:val="22"/>
+        </w:rPr>
+        <w:t>) {</w:t>
+      </w:r>
+    </w:p>
+    <w:p>
+      <w:pPr>
+        <w:pStyle w:val="NoSpacing"/>
+        <w:rPr>
+          <w:rStyle w:val="HTMLCode"/>
+          <w:rFonts w:ascii="Times New Roman" w:eastAsiaTheme="minorHAnsi" w:hAnsi="Times New Roman" w:cstheme="minorBidi"/>
+          <w:sz w:val="24"/>
+          <w:szCs w:val="22"/>
+        </w:rPr>
+      </w:pPr>
+    </w:p>
+    <w:p>
+      <w:pPr>
+        <w:pStyle w:val="NoSpacing"/>
+        <w:rPr>
+          <w:rStyle w:val="HTMLCode"/>
+          <w:rFonts w:ascii="Times New Roman" w:eastAsiaTheme="minorHAnsi" w:hAnsi="Times New Roman" w:cstheme="minorBidi"/>
+          <w:sz w:val="24"/>
+          <w:szCs w:val="22"/>
+        </w:rPr>
+      </w:pPr>
+      <w:r>
+        <w:rPr>
+          <w:rStyle w:val="HTMLCode"/>
+          <w:rFonts w:ascii="Times New Roman" w:eastAsiaTheme="minorHAnsi" w:hAnsi="Times New Roman" w:cstheme="minorBidi"/>
+          <w:sz w:val="24"/>
+          <w:szCs w:val="22"/>
+        </w:rPr>
+        <w:t xml:space="preserve">  </w:t>
+      </w:r>
+      <w:r>
+        <w:rPr>
+          <w:rStyle w:val="g"/>
+        </w:rPr>
+        <w:t>const</w:t>
+      </w:r>
+      <w:r>
+        <w:rPr>
+          <w:rStyle w:val="HTMLCode"/>
+          <w:rFonts w:ascii="Times New Roman" w:eastAsiaTheme="minorHAnsi" w:hAnsi="Times New Roman" w:cstheme="minorBidi"/>
+          <w:sz w:val="24"/>
+          <w:szCs w:val="22"/>
+        </w:rPr>
+        <w:t xml:space="preserve"> </w:t>
+      </w:r>
+      <w:proofErr w:type="gramStart"/>
+      <w:r>
+        <w:rPr>
+          <w:rStyle w:val="HTMLCode"/>
+          <w:rFonts w:ascii="Times New Roman" w:eastAsiaTheme="minorHAnsi" w:hAnsi="Times New Roman" w:cstheme="minorBidi"/>
+          <w:sz w:val="24"/>
+          <w:szCs w:val="22"/>
+        </w:rPr>
+        <w:t>{ user</w:t>
+      </w:r>
+      <w:proofErr w:type="gramEnd"/>
+      <w:r>
+        <w:rPr>
+          <w:rStyle w:val="HTMLCode"/>
+          <w:rFonts w:ascii="Times New Roman" w:eastAsiaTheme="minorHAnsi" w:hAnsi="Times New Roman" w:cstheme="minorBidi"/>
+          <w:sz w:val="24"/>
+          <w:szCs w:val="22"/>
+        </w:rPr>
+        <w:t xml:space="preserve"> } </w:t>
+      </w:r>
+      <w:r>
+        <w:rPr>
+          <w:rStyle w:val="g"/>
+        </w:rPr>
+        <w:t>=</w:t>
+      </w:r>
+      <w:r>
+        <w:rPr>
+          <w:rStyle w:val="HTMLCode"/>
+          <w:rFonts w:ascii="Times New Roman" w:eastAsiaTheme="minorHAnsi" w:hAnsi="Times New Roman" w:cstheme="minorBidi"/>
+          <w:sz w:val="24"/>
+          <w:szCs w:val="22"/>
+        </w:rPr>
+        <w:t xml:space="preserve"> </w:t>
+      </w:r>
+      <w:proofErr w:type="spellStart"/>
+      <w:r>
+        <w:rPr>
+          <w:rStyle w:val="m"/>
+        </w:rPr>
+        <w:t>useAuth</w:t>
+      </w:r>
+      <w:proofErr w:type="spellEnd"/>
+      <w:r>
+        <w:rPr>
+          <w:rStyle w:val="HTMLCode"/>
+          <w:rFonts w:ascii="Times New Roman" w:eastAsiaTheme="minorHAnsi" w:hAnsi="Times New Roman" w:cstheme="minorBidi"/>
+          <w:sz w:val="24"/>
+          <w:szCs w:val="22"/>
+        </w:rPr>
+        <w:t>();</w:t>
+      </w:r>
+    </w:p>
+    <w:p>
+      <w:pPr>
+        <w:pStyle w:val="NoSpacing"/>
+        <w:rPr>
+          <w:rStyle w:val="HTMLCode"/>
+          <w:rFonts w:ascii="Times New Roman" w:eastAsiaTheme="minorHAnsi" w:hAnsi="Times New Roman" w:cstheme="minorBidi"/>
+          <w:sz w:val="24"/>
+          <w:szCs w:val="22"/>
+        </w:rPr>
+      </w:pPr>
+      <w:r>
+        <w:rPr>
+          <w:rStyle w:val="HTMLCode"/>
+          <w:rFonts w:ascii="Times New Roman" w:eastAsiaTheme="minorHAnsi" w:hAnsi="Times New Roman" w:cstheme="minorBidi"/>
+          <w:sz w:val="24"/>
+          <w:szCs w:val="22"/>
+        </w:rPr>
+        <w:t xml:space="preserve">  </w:t>
+      </w:r>
+      <w:r>
+        <w:rPr>
+          <w:rStyle w:val="g"/>
+        </w:rPr>
+        <w:t>return</w:t>
+      </w:r>
+      <w:r>
+        <w:rPr>
+          <w:rStyle w:val="HTMLCode"/>
+          <w:rFonts w:ascii="Times New Roman" w:eastAsiaTheme="minorHAnsi" w:hAnsi="Times New Roman" w:cstheme="minorBidi"/>
+          <w:sz w:val="24"/>
+          <w:szCs w:val="22"/>
+        </w:rPr>
+        <w:t xml:space="preserve"> (</w:t>
+      </w:r>
+    </w:p>
+    <w:p>
+      <w:pPr>
+        <w:pStyle w:val="NoSpacing"/>
+        <w:rPr>
+          <w:rStyle w:val="HTMLCode"/>
+          <w:rFonts w:ascii="Times New Roman" w:eastAsiaTheme="minorHAnsi" w:hAnsi="Times New Roman" w:cstheme="minorBidi"/>
+          <w:sz w:val="24"/>
+          <w:szCs w:val="22"/>
+        </w:rPr>
+      </w:pPr>
+      <w:r>
+        <w:rPr>
+          <w:rStyle w:val="HTMLCode"/>
+          <w:rFonts w:ascii="Times New Roman" w:eastAsiaTheme="minorHAnsi" w:hAnsi="Times New Roman" w:cstheme="minorBidi"/>
+          <w:sz w:val="24"/>
+          <w:szCs w:val="22"/>
+        </w:rPr>
+        <w:t xml:space="preserve">    </w:t>
+      </w:r>
+      <w:r>
+        <w:rPr>
+          <w:rStyle w:val="o"/>
+        </w:rPr>
+        <w:t>&lt;&gt;</w:t>
+      </w:r>
+    </w:p>
+    <w:p>
+      <w:pPr>
+        <w:pStyle w:val="NoSpacing"/>
+        <w:rPr>
+          <w:rStyle w:val="HTMLCode"/>
+          <w:rFonts w:ascii="Times New Roman" w:eastAsiaTheme="minorHAnsi" w:hAnsi="Times New Roman" w:cstheme="minorBidi"/>
+          <w:sz w:val="24"/>
+          <w:szCs w:val="22"/>
+        </w:rPr>
+      </w:pPr>
+      <w:r>
+        <w:rPr>
+          <w:rStyle w:val="HTMLCode"/>
+          <w:rFonts w:ascii="Times New Roman" w:eastAsiaTheme="minorHAnsi" w:hAnsi="Times New Roman" w:cstheme="minorBidi"/>
+          <w:sz w:val="24"/>
+          <w:szCs w:val="22"/>
+        </w:rPr>
+        <w:t xml:space="preserve">      {</w:t>
+      </w:r>
+    </w:p>
+    <w:p>
+      <w:pPr>
+        <w:pStyle w:val="NoSpacing"/>
+        <w:rPr>
+          <w:rStyle w:val="HTMLCode"/>
+          <w:rFonts w:ascii="Times New Roman" w:eastAsiaTheme="minorHAnsi" w:hAnsi="Times New Roman" w:cstheme="minorBidi"/>
+          <w:sz w:val="24"/>
+          <w:szCs w:val="22"/>
+        </w:rPr>
+      </w:pPr>
+      <w:r>
+        <w:rPr>
+          <w:rStyle w:val="HTMLCode"/>
+          <w:rFonts w:ascii="Times New Roman" w:eastAsiaTheme="minorHAnsi" w:hAnsi="Times New Roman" w:cstheme="minorBidi"/>
+          <w:sz w:val="24"/>
+          <w:szCs w:val="22"/>
+        </w:rPr>
+        <w:t xml:space="preserve">        </w:t>
+      </w:r>
+      <w:proofErr w:type="gramStart"/>
+      <w:r>
+        <w:rPr>
+          <w:rStyle w:val="m"/>
+        </w:rPr>
+        <w:t>user</w:t>
+      </w:r>
+      <w:r>
+        <w:rPr>
+          <w:rStyle w:val="HTMLCode"/>
+          <w:rFonts w:ascii="Times New Roman" w:eastAsiaTheme="minorHAnsi" w:hAnsi="Times New Roman" w:cstheme="minorBidi"/>
+          <w:sz w:val="24"/>
+          <w:szCs w:val="22"/>
+        </w:rPr>
+        <w:t xml:space="preserve"> </w:t>
+      </w:r>
+      <w:r>
+        <w:rPr>
+          <w:rStyle w:val="g"/>
+        </w:rPr>
+        <w:t>?</w:t>
+      </w:r>
+      <w:proofErr w:type="gramEnd"/>
+      <w:r>
+        <w:rPr>
+          <w:rStyle w:val="HTMLCode"/>
+          <w:rFonts w:ascii="Times New Roman" w:eastAsiaTheme="minorHAnsi" w:hAnsi="Times New Roman" w:cstheme="minorBidi"/>
+          <w:sz w:val="24"/>
+          <w:szCs w:val="22"/>
+        </w:rPr>
+        <w:t xml:space="preserve"> (</w:t>
+      </w:r>
+    </w:p>
+    <w:p>
+      <w:pPr>
+        <w:pStyle w:val="NoSpacing"/>
+        <w:rPr>
+          <w:rStyle w:val="HTMLCode"/>
+          <w:rFonts w:ascii="Times New Roman" w:eastAsiaTheme="minorHAnsi" w:hAnsi="Times New Roman" w:cstheme="minorBidi"/>
+          <w:sz w:val="24"/>
+          <w:szCs w:val="22"/>
+        </w:rPr>
+      </w:pPr>
+      <w:r>
+        <w:rPr>
+          <w:rStyle w:val="HTMLCode"/>
+          <w:rFonts w:ascii="Times New Roman" w:eastAsiaTheme="minorHAnsi" w:hAnsi="Times New Roman" w:cstheme="minorBidi"/>
+          <w:sz w:val="24"/>
+          <w:szCs w:val="22"/>
+        </w:rPr>
+        <w:t xml:space="preserve">          </w:t>
+      </w:r>
+      <w:r>
+        <w:rPr>
+          <w:rStyle w:val="o"/>
+        </w:rPr>
+        <w:t>&lt;&gt;</w:t>
+      </w:r>
+    </w:p>
+    <w:p>
+      <w:pPr>
+        <w:pStyle w:val="NoSpacing"/>
+        <w:rPr>
+          <w:rStyle w:val="HTMLCode"/>
+          <w:rFonts w:ascii="Times New Roman" w:eastAsiaTheme="minorHAnsi" w:hAnsi="Times New Roman" w:cstheme="minorBidi"/>
+          <w:sz w:val="24"/>
+          <w:szCs w:val="22"/>
+        </w:rPr>
+      </w:pPr>
+      <w:r>
+        <w:rPr>
+          <w:rStyle w:val="HTMLCode"/>
+          <w:rFonts w:ascii="Times New Roman" w:eastAsiaTheme="minorHAnsi" w:hAnsi="Times New Roman" w:cstheme="minorBidi"/>
+          <w:sz w:val="24"/>
+          <w:szCs w:val="22"/>
+        </w:rPr>
+        <w:t xml:space="preserve">            </w:t>
+      </w:r>
+      <w:r>
+        <w:rPr>
+          <w:rStyle w:val="o"/>
+        </w:rPr>
+        <w:t>&lt;Navbar</w:t>
+      </w:r>
+      <w:r>
+        <w:rPr>
+          <w:rStyle w:val="HTMLCode"/>
+          <w:rFonts w:ascii="Times New Roman" w:eastAsiaTheme="minorHAnsi" w:hAnsi="Times New Roman" w:cstheme="minorBidi"/>
+          <w:sz w:val="24"/>
+          <w:szCs w:val="22"/>
+        </w:rPr>
+        <w:t xml:space="preserve"> </w:t>
+      </w:r>
+      <w:r>
+        <w:rPr>
+          <w:rStyle w:val="o"/>
+        </w:rPr>
+        <w:t>/&gt;</w:t>
+      </w:r>
+    </w:p>
+    <w:p>
+      <w:pPr>
+        <w:pStyle w:val="NoSpacing"/>
+        <w:rPr>
+          <w:rStyle w:val="HTMLCode"/>
+          <w:rFonts w:ascii="Times New Roman" w:eastAsiaTheme="minorHAnsi" w:hAnsi="Times New Roman" w:cstheme="minorBidi"/>
+          <w:sz w:val="24"/>
+          <w:szCs w:val="22"/>
+        </w:rPr>
+      </w:pPr>
+      <w:r>
+        <w:rPr>
+          <w:rStyle w:val="HTMLCode"/>
+          <w:rFonts w:ascii="Times New Roman" w:eastAsiaTheme="minorHAnsi" w:hAnsi="Times New Roman" w:cstheme="minorBidi"/>
+          <w:sz w:val="24"/>
+          <w:szCs w:val="22"/>
+        </w:rPr>
+        <w:t xml:space="preserve">            </w:t>
+      </w:r>
+      <w:r>
+        <w:rPr>
+          <w:rStyle w:val="o"/>
+        </w:rPr>
+        <w:t>&lt;Dashboard</w:t>
+      </w:r>
+      <w:r>
+        <w:rPr>
+          <w:rStyle w:val="HTMLCode"/>
+          <w:rFonts w:ascii="Times New Roman" w:eastAsiaTheme="minorHAnsi" w:hAnsi="Times New Roman" w:cstheme="minorBidi"/>
+          <w:sz w:val="24"/>
+          <w:szCs w:val="22"/>
+        </w:rPr>
+        <w:t xml:space="preserve"> </w:t>
+      </w:r>
+      <w:r>
+        <w:rPr>
+          <w:rStyle w:val="o"/>
+        </w:rPr>
+        <w:t>/&gt;</w:t>
+      </w:r>
+    </w:p>
+    <w:p>
+      <w:pPr>
+        <w:pStyle w:val="NoSpacing"/>
+        <w:rPr>
+          <w:rStyle w:val="HTMLCode"/>
+          <w:rFonts w:ascii="Times New Roman" w:eastAsiaTheme="minorHAnsi" w:hAnsi="Times New Roman" w:cstheme="minorBidi"/>
+          <w:sz w:val="24"/>
+          <w:szCs w:val="22"/>
+        </w:rPr>
+      </w:pPr>
+      <w:r>
+        <w:rPr>
+          <w:rStyle w:val="HTMLCode"/>
+          <w:rFonts w:ascii="Times New Roman" w:eastAsiaTheme="minorHAnsi" w:hAnsi="Times New Roman" w:cstheme="minorBidi"/>
+          <w:sz w:val="24"/>
+          <w:szCs w:val="22"/>
+        </w:rPr>
+        <w:t xml:space="preserve">          </w:t>
+      </w:r>
+      <w:r>
+        <w:rPr>
+          <w:rStyle w:val="o"/>
+        </w:rPr>
+        <w:t>&lt;/&gt;</w:t>
+      </w:r>
+    </w:p>
+    <w:p>
+      <w:pPr>
+        <w:pStyle w:val="NoSpacing"/>
+        <w:rPr>
+          <w:rStyle w:val="HTMLCode"/>
+          <w:rFonts w:ascii="Times New Roman" w:eastAsiaTheme="minorHAnsi" w:hAnsi="Times New Roman" w:cstheme="minorBidi"/>
+          <w:sz w:val="24"/>
+          <w:szCs w:val="22"/>
+        </w:rPr>
+      </w:pPr>
+      <w:r>
+        <w:rPr>
+          <w:rStyle w:val="HTMLCode"/>
+          <w:rFonts w:ascii="Times New Roman" w:eastAsiaTheme="minorHAnsi" w:hAnsi="Times New Roman" w:cstheme="minorBidi"/>
+          <w:sz w:val="24"/>
+          <w:szCs w:val="22"/>
+        </w:rPr>
+        <w:t xml:space="preserve">        ) </w:t>
+      </w:r>
+      <w:r>
+        <w:rPr>
+          <w:rStyle w:val="g"/>
+        </w:rPr>
+        <w:t>:</w:t>
+      </w:r>
+      <w:r>
+        <w:rPr>
+          <w:rStyle w:val="HTMLCode"/>
+          <w:rFonts w:ascii="Times New Roman" w:eastAsiaTheme="minorHAnsi" w:hAnsi="Times New Roman" w:cstheme="minorBidi"/>
+          <w:sz w:val="24"/>
+          <w:szCs w:val="22"/>
+        </w:rPr>
+        <w:t xml:space="preserve"> (</w:t>
+      </w:r>
+    </w:p>
+    <w:p>
+      <w:pPr>
+        <w:pStyle w:val="NoSpacing"/>
+        <w:rPr>
+          <w:rStyle w:val="HTMLCode"/>
+          <w:rFonts w:ascii="Times New Roman" w:eastAsiaTheme="minorHAnsi" w:hAnsi="Times New Roman" w:cstheme="minorBidi"/>
+          <w:sz w:val="24"/>
+          <w:szCs w:val="22"/>
+        </w:rPr>
+      </w:pPr>
+      <w:r>
+        <w:rPr>
+          <w:rStyle w:val="HTMLCode"/>
+          <w:rFonts w:ascii="Times New Roman" w:eastAsiaTheme="minorHAnsi" w:hAnsi="Times New Roman" w:cstheme="minorBidi"/>
+          <w:sz w:val="24"/>
+          <w:szCs w:val="22"/>
+        </w:rPr>
+        <w:t xml:space="preserve">          </w:t>
+      </w:r>
+      <w:r>
+        <w:rPr>
+          <w:rStyle w:val="o"/>
+        </w:rPr>
+        <w:t>&lt;Login</w:t>
+      </w:r>
+      <w:r>
+        <w:rPr>
+          <w:rStyle w:val="HTMLCode"/>
+          <w:rFonts w:ascii="Times New Roman" w:eastAsiaTheme="minorHAnsi" w:hAnsi="Times New Roman" w:cstheme="minorBidi"/>
+          <w:sz w:val="24"/>
+          <w:szCs w:val="22"/>
+        </w:rPr>
+        <w:t xml:space="preserve"> </w:t>
+      </w:r>
+      <w:r>
+        <w:rPr>
+          <w:rStyle w:val="o"/>
+        </w:rPr>
+        <w:t>/&gt;</w:t>
+      </w:r>
+    </w:p>
+    <w:p>
+      <w:pPr>
+        <w:pStyle w:val="NoSpacing"/>
+        <w:rPr>
+          <w:rStyle w:val="HTMLCode"/>
+          <w:rFonts w:ascii="Times New Roman" w:eastAsiaTheme="minorHAnsi" w:hAnsi="Times New Roman" w:cstheme="minorBidi"/>
+          <w:sz w:val="24"/>
+          <w:szCs w:val="22"/>
+        </w:rPr>
+      </w:pPr>
+      <w:r>
+        <w:rPr>
+          <w:rStyle w:val="HTMLCode"/>
+          <w:rFonts w:ascii="Times New Roman" w:eastAsiaTheme="minorHAnsi" w:hAnsi="Times New Roman" w:cstheme="minorBidi"/>
+          <w:sz w:val="24"/>
+          <w:szCs w:val="22"/>
+        </w:rPr>
+        <w:t xml:space="preserve">        )</w:t>
+      </w:r>
+    </w:p>
+    <w:p>
+      <w:pPr>
+        <w:pStyle w:val="NoSpacing"/>
+        <w:rPr>
+          <w:rStyle w:val="HTMLCode"/>
+          <w:rFonts w:ascii="Times New Roman" w:eastAsiaTheme="minorHAnsi" w:hAnsi="Times New Roman" w:cstheme="minorBidi"/>
+          <w:sz w:val="24"/>
+          <w:szCs w:val="22"/>
+        </w:rPr>
+      </w:pPr>
+      <w:r>
+        <w:rPr>
+          <w:rStyle w:val="HTMLCode"/>
+          <w:rFonts w:ascii="Times New Roman" w:eastAsiaTheme="minorHAnsi" w:hAnsi="Times New Roman" w:cstheme="minorBidi"/>
+          <w:sz w:val="24"/>
+          <w:szCs w:val="22"/>
+        </w:rPr>
+        <w:t xml:space="preserve">      }</w:t>
+      </w:r>
+    </w:p>
+    <w:p>
+      <w:pPr>
+        <w:pStyle w:val="NoSpacing"/>
+        <w:rPr>
+          <w:rStyle w:val="HTMLCode"/>
+          <w:rFonts w:ascii="Times New Roman" w:eastAsiaTheme="minorHAnsi" w:hAnsi="Times New Roman" w:cstheme="minorBidi"/>
+          <w:sz w:val="24"/>
+          <w:szCs w:val="22"/>
+        </w:rPr>
+      </w:pPr>
+      <w:r>
+        <w:rPr>
+          <w:rStyle w:val="HTMLCode"/>
+          <w:rFonts w:ascii="Times New Roman" w:eastAsiaTheme="minorHAnsi" w:hAnsi="Times New Roman" w:cstheme="minorBidi"/>
+          <w:sz w:val="24"/>
+          <w:szCs w:val="22"/>
+        </w:rPr>
+        <w:t xml:space="preserve">    </w:t>
+      </w:r>
+      <w:r>
+        <w:rPr>
+          <w:rStyle w:val="o"/>
+        </w:rPr>
+        <w:t>&lt;/&gt;</w:t>
+      </w:r>
+    </w:p>
+    <w:p>
+      <w:pPr>
+        <w:pStyle w:val="NoSpacing"/>
+        <w:rPr>
+          <w:rStyle w:val="HTMLCode"/>
+          <w:rFonts w:ascii="Times New Roman" w:eastAsiaTheme="minorHAnsi" w:hAnsi="Times New Roman" w:cstheme="minorBidi"/>
+          <w:sz w:val="24"/>
+          <w:szCs w:val="22"/>
+        </w:rPr>
+      </w:pPr>
+    </w:p>
+    <w:p>
+      <w:pPr>
+        <w:pStyle w:val="NoSpacing"/>
+        <w:rPr>
+          <w:rStyle w:val="HTMLCode"/>
+          <w:rFonts w:ascii="Times New Roman" w:eastAsiaTheme="minorHAnsi" w:hAnsi="Times New Roman" w:cstheme="minorBidi"/>
+          <w:sz w:val="24"/>
+          <w:szCs w:val="22"/>
+        </w:rPr>
+      </w:pPr>
+      <w:r>
+        <w:rPr>
+          <w:rStyle w:val="HTMLCode"/>
+          <w:rFonts w:ascii="Times New Roman" w:eastAsiaTheme="minorHAnsi" w:hAnsi="Times New Roman" w:cstheme="minorBidi"/>
+          <w:sz w:val="24"/>
+          <w:szCs w:val="22"/>
+        </w:rPr>
+        <w:t xml:space="preserve">  );</w:t>
+      </w:r>
+    </w:p>
+    <w:p>
+      <w:pPr>
+        <w:pStyle w:val="NoSpacing"/>
+        <w:rPr>
+          <w:rStyle w:val="HTMLCode"/>
+          <w:rFonts w:ascii="Times New Roman" w:eastAsiaTheme="minorHAnsi" w:hAnsi="Times New Roman" w:cstheme="minorBidi"/>
+          <w:sz w:val="24"/>
+          <w:szCs w:val="22"/>
+        </w:rPr>
+      </w:pPr>
+      <w:r>
+        <w:rPr>
+          <w:rStyle w:val="HTMLCode"/>
+          <w:rFonts w:ascii="Times New Roman" w:eastAsiaTheme="minorHAnsi" w:hAnsi="Times New Roman" w:cstheme="minorBidi"/>
+          <w:sz w:val="24"/>
+          <w:szCs w:val="22"/>
+        </w:rPr>
+        <w:t>}</w:t>
+      </w:r>
+    </w:p>
+    <w:p>
+      <w:pPr>
+        <w:pStyle w:val="NoSpacing"/>
+        <w:rPr>
+          <w:rStyle w:val="HTMLCode"/>
+          <w:rFonts w:ascii="Times New Roman" w:eastAsiaTheme="minorHAnsi" w:hAnsi="Times New Roman" w:cstheme="minorBidi"/>
+          <w:sz w:val="24"/>
+          <w:szCs w:val="22"/>
+        </w:rPr>
+      </w:pPr>
+    </w:p>
+    <w:p>
+      <w:pPr>
+        <w:pStyle w:val="NoSpacing"/>
+      </w:pPr>
+      <w:r>
+        <w:rPr>
+          <w:rStyle w:val="g"/>
+        </w:rPr>
+        <w:t>export</w:t>
+      </w:r>
+      <w:r>
+        <w:rPr>
+          <w:rStyle w:val="HTMLCode"/>
+          <w:rFonts w:ascii="Times New Roman" w:eastAsiaTheme="minorHAnsi" w:hAnsi="Times New Roman" w:cstheme="minorBidi"/>
+          <w:sz w:val="24"/>
+          <w:szCs w:val="22"/>
+        </w:rPr>
+        <w:t xml:space="preserve"> </w:t>
+      </w:r>
+      <w:r>
+        <w:rPr>
+          <w:rStyle w:val="g"/>
+        </w:rPr>
+        <w:t>default</w:t>
+      </w:r>
+      <w:r>
+        <w:rPr>
+          <w:rStyle w:val="HTMLCode"/>
+          <w:rFonts w:ascii="Times New Roman" w:eastAsiaTheme="minorHAnsi" w:hAnsi="Times New Roman" w:cstheme="minorBidi"/>
+          <w:sz w:val="24"/>
+          <w:szCs w:val="22"/>
+        </w:rPr>
+        <w:t xml:space="preserve"> </w:t>
+      </w:r>
+      <w:r>
+        <w:rPr>
+          <w:rStyle w:val="m"/>
+        </w:rPr>
+        <w:t>App</w:t>
+      </w:r>
+      <w:r>
+        <w:rPr>
+          <w:rStyle w:val="HTMLCode"/>
+          <w:rFonts w:ascii="Times New Roman" w:eastAsiaTheme="minorHAnsi" w:hAnsi="Times New Roman" w:cstheme="minorBidi"/>
+          <w:sz w:val="24"/>
+          <w:szCs w:val="22"/>
+        </w:rPr>
+        <w:t>;</w:t>
+      </w:r>
+    </w:p>
+    <w:p>
+      <w:pPr>
+        <w:pStyle w:val="NoSpacing"/>
+      </w:pPr>
+    </w:p>
+    <w:p>
+      <w:pPr>
+        <w:pStyle w:val="NoSpacing"/>
+      </w:pPr>
+    </w:p>
+    <w:p>
+      <w:pPr>
+        <w:pStyle w:val="NoSpacing"/>
+      </w:pPr>
+      <w:proofErr w:type="spellStart"/>
+      <w:r>
+        <w:t>localstorage</w:t>
+      </w:r>
+      <w:proofErr w:type="spellEnd"/>
+      <w:r>
+        <w:t xml:space="preserve"> is used to persists data even after page reload.</w:t>
+      </w:r>
       <w:bookmarkStart w:id="0" w:name="_GoBack"/>
       <w:bookmarkEnd w:id="0"/>
     </w:p>

</xml_diff>